<commit_message>
Trim homework 1 requirements to 10 per type and apply header edits
Keep 10 requirements of each type instead of 15. Functional requirements
are merged so all modules stay covered. The header now lists only the
repository and the site (VPN note), and the service-functions module is
removed, matching the user's edits.

Co-Authored-By: Claude Opus 5.5 <noreply@anthropic.com>
Claude-Session: https://claude.ai/code/session_01ET6XeGXc1uvXF3g2fz6oM4
</commit_message>
<xml_diff>
--- a/docs/homework-1/rutrip-requirements.docx
+++ b/docs/homework-1/rutrip-requirements.docx
@@ -136,7 +136,7 @@
                 <w:b/>
                 <w:bCs/>
               </w:rPr>
-              <w:t xml:space="preserve">Команда</w:t>
+              <w:t xml:space="preserve">Репозиторий</w:t>
             </w:r>
           </w:p>
         </w:tc>
@@ -165,7 +165,7 @@
                 <w:b w:val="false"/>
                 <w:bCs w:val="false"/>
               </w:rPr>
-              <w:t xml:space="preserve">________________ (ФИО участников, группа)</w:t>
+              <w:t xml:space="preserve">https://github.com/lonerry/rutrip</w:t>
             </w:r>
           </w:p>
         </w:tc>
@@ -199,7 +199,7 @@
                 <w:b/>
                 <w:bCs/>
               </w:rPr>
-              <w:t xml:space="preserve">Репозиторий</w:t>
+              <w:t xml:space="preserve">Сайт</w:t>
             </w:r>
           </w:p>
         </w:tc>
@@ -228,133 +228,7 @@
                 <w:b w:val="false"/>
                 <w:bCs w:val="false"/>
               </w:rPr>
-              <w:t xml:space="preserve">https://github.com/lonerry/rutrip</w:t>
-            </w:r>
-          </w:p>
-        </w:tc>
-      </w:tr>
-      <w:tr>
-        <w:trPr>
-          <w:cantSplit/>
-        </w:trPr>
-        <w:tc>
-          <w:tcPr>
-            <w:tcW w:type="dxa" w:w="2600"/>
-            <w:tcBorders>
-              <w:top w:val="single" w:color="BFBFBF" w:sz="4"/>
-              <w:left w:val="single" w:color="BFBFBF" w:sz="4"/>
-              <w:bottom w:val="single" w:color="BFBFBF" w:sz="4"/>
-              <w:right w:val="single" w:color="BFBFBF" w:sz="4"/>
-            </w:tcBorders>
-            <w:tcMar>
-              <w:top w:type="dxa" w:w="60"/>
-              <w:left w:type="dxa" w:w="100"/>
-              <w:bottom w:type="dxa" w:w="60"/>
-              <w:right w:type="dxa" w:w="100"/>
-            </w:tcMar>
-          </w:tcPr>
-          <w:p>
-            <w:pPr>
-              <w:jc w:val="left"/>
-            </w:pPr>
-            <w:r>
-              <w:rPr>
-                <w:b/>
-                <w:bCs/>
-              </w:rPr>
-              <w:t xml:space="preserve">Рабочая версия</w:t>
-            </w:r>
-          </w:p>
-        </w:tc>
-        <w:tc>
-          <w:tcPr>
-            <w:tcW w:type="dxa" w:w="7038"/>
-            <w:tcBorders>
-              <w:top w:val="single" w:color="BFBFBF" w:sz="4"/>
-              <w:left w:val="single" w:color="BFBFBF" w:sz="4"/>
-              <w:bottom w:val="single" w:color="BFBFBF" w:sz="4"/>
-              <w:right w:val="single" w:color="BFBFBF" w:sz="4"/>
-            </w:tcBorders>
-            <w:tcMar>
-              <w:top w:type="dxa" w:w="60"/>
-              <w:left w:type="dxa" w:w="100"/>
-              <w:bottom w:type="dxa" w:w="60"/>
-              <w:right w:type="dxa" w:w="100"/>
-            </w:tcMar>
-          </w:tcPr>
-          <w:p>
-            <w:pPr>
-              <w:jc w:val="left"/>
-            </w:pPr>
-            <w:r>
-              <w:rPr>
-                <w:b w:val="false"/>
-                <w:bCs w:val="false"/>
-              </w:rPr>
-              <w:t xml:space="preserve">http://89.124.81.146</w:t>
-            </w:r>
-          </w:p>
-        </w:tc>
-      </w:tr>
-      <w:tr>
-        <w:trPr>
-          <w:cantSplit/>
-        </w:trPr>
-        <w:tc>
-          <w:tcPr>
-            <w:tcW w:type="dxa" w:w="2600"/>
-            <w:tcBorders>
-              <w:top w:val="single" w:color="BFBFBF" w:sz="4"/>
-              <w:left w:val="single" w:color="BFBFBF" w:sz="4"/>
-              <w:bottom w:val="single" w:color="BFBFBF" w:sz="4"/>
-              <w:right w:val="single" w:color="BFBFBF" w:sz="4"/>
-            </w:tcBorders>
-            <w:tcMar>
-              <w:top w:type="dxa" w:w="60"/>
-              <w:left w:type="dxa" w:w="100"/>
-              <w:bottom w:type="dxa" w:w="60"/>
-              <w:right w:type="dxa" w:w="100"/>
-            </w:tcMar>
-          </w:tcPr>
-          <w:p>
-            <w:pPr>
-              <w:jc w:val="left"/>
-            </w:pPr>
-            <w:r>
-              <w:rPr>
-                <w:b/>
-                <w:bCs/>
-              </w:rPr>
-              <w:t xml:space="preserve">Версия документа</w:t>
-            </w:r>
-          </w:p>
-        </w:tc>
-        <w:tc>
-          <w:tcPr>
-            <w:tcW w:type="dxa" w:w="7038"/>
-            <w:tcBorders>
-              <w:top w:val="single" w:color="BFBFBF" w:sz="4"/>
-              <w:left w:val="single" w:color="BFBFBF" w:sz="4"/>
-              <w:bottom w:val="single" w:color="BFBFBF" w:sz="4"/>
-              <w:right w:val="single" w:color="BFBFBF" w:sz="4"/>
-            </w:tcBorders>
-            <w:tcMar>
-              <w:top w:type="dxa" w:w="60"/>
-              <w:left w:type="dxa" w:w="100"/>
-              <w:bottom w:type="dxa" w:w="60"/>
-              <w:right w:type="dxa" w:w="100"/>
-            </w:tcMar>
-          </w:tcPr>
-          <w:p>
-            <w:pPr>
-              <w:jc w:val="left"/>
-            </w:pPr>
-            <w:r>
-              <w:rPr>
-                <w:b w:val="false"/>
-                <w:bCs w:val="false"/>
-              </w:rPr>
-              <w:t xml:space="preserve">1.0</w:t>
+              <w:t xml:space="preserve">http://89.124.81.146 (с впн заходить)</w:t>
             </w:r>
           </w:p>
         </w:tc>
@@ -972,26 +846,6 @@
     </w:p>
     <w:p>
       <w:pPr>
-        <w:pStyle w:val="ListParagraph"/>
-        <w:numPr>
-          <w:ilvl w:val="0"/>
-          <w:numId w:val="2"/>
-        </w:numPr>
-        <w:spacing w:after="80"/>
-      </w:pPr>
-      <w:r>
-        <w:rPr>
-          <w:b/>
-          <w:bCs/>
-        </w:rPr>
-        <w:t xml:space="preserve">Служебные функции: </w:t>
-      </w:r>
-      <w:r>
-        <w:t xml:space="preserve">документация API (Swagger UI), проверка работоспособности (/health), отправка писем через SMTP.</w:t>
-      </w:r>
-    </w:p>
-    <w:p>
-      <w:pPr>
         <w:pStyle w:val="Heading1"/>
       </w:pPr>
       <w:r>
@@ -1197,7 +1051,7 @@
                 <w:b w:val="false"/>
                 <w:bCs w:val="false"/>
               </w:rPr>
-              <w:t xml:space="preserve">15</w:t>
+              <w:t xml:space="preserve">10</w:t>
             </w:r>
           </w:p>
         </w:tc>
@@ -1289,7 +1143,7 @@
                 <w:b w:val="false"/>
                 <w:bCs w:val="false"/>
               </w:rPr>
-              <w:t xml:space="preserve">15</w:t>
+              <w:t xml:space="preserve">10</w:t>
             </w:r>
           </w:p>
         </w:tc>
@@ -1381,7 +1235,7 @@
                 <w:b w:val="false"/>
                 <w:bCs w:val="false"/>
               </w:rPr>
-              <w:t xml:space="preserve">15</w:t>
+              <w:t xml:space="preserve">10</w:t>
             </w:r>
           </w:p>
         </w:tc>
@@ -1473,7 +1327,7 @@
                 <w:b w:val="false"/>
                 <w:bCs w:val="false"/>
               </w:rPr>
-              <w:t xml:space="preserve">15</w:t>
+              <w:t xml:space="preserve">10</w:t>
             </w:r>
           </w:p>
         </w:tc>
@@ -1565,7 +1419,7 @@
                 <w:b w:val="false"/>
                 <w:bCs w:val="false"/>
               </w:rPr>
-              <w:t xml:space="preserve">15</w:t>
+              <w:t xml:space="preserve">10</w:t>
             </w:r>
           </w:p>
         </w:tc>
@@ -1657,7 +1511,7 @@
                 <w:b w:val="false"/>
                 <w:bCs w:val="false"/>
               </w:rPr>
-              <w:t xml:space="preserve">15</w:t>
+              <w:t xml:space="preserve">10</w:t>
             </w:r>
           </w:p>
         </w:tc>
@@ -1749,7 +1603,7 @@
                 <w:b w:val="false"/>
                 <w:bCs w:val="false"/>
               </w:rPr>
-              <w:t xml:space="preserve">15</w:t>
+              <w:t xml:space="preserve">10</w:t>
             </w:r>
           </w:p>
         </w:tc>
@@ -1841,7 +1695,7 @@
                 <w:b w:val="false"/>
                 <w:bCs w:val="false"/>
               </w:rPr>
-              <w:t xml:space="preserve">15</w:t>
+              <w:t xml:space="preserve">10</w:t>
             </w:r>
           </w:p>
         </w:tc>
@@ -2328,7 +2182,7 @@
                 <w:b w:val="false"/>
                 <w:bCs w:val="false"/>
               </w:rPr>
-              <w:t xml:space="preserve">Сформировать базу пользовательского контента: в среднем не менее 5 единиц контента (точек, историй, фото) на одного активного пользователя.</w:t>
+              <w:t xml:space="preserve">Запустить MVP с минимальными затратами: только открытые технологии и бесплатные тарифы картографических сервисов, расходы на инфраструктуру — не более 1 000 ₽ в месяц (один VPS).</w:t>
             </w:r>
           </w:p>
         </w:tc>
@@ -2391,7 +2245,7 @@
                 <w:b w:val="false"/>
                 <w:bCs w:val="false"/>
               </w:rPr>
-              <w:t xml:space="preserve">Запустить MVP с минимальными затратами: только открытые технологии и бесплатные тарифы картографических сервисов, расходы на инфраструктуру — не более 1 000 ₽ в месяц (один VPS).</w:t>
+              <w:t xml:space="preserve">Снизить зависимость от одного поставщика карт: сервис должен продолжать работать при недоступности любого одного картографического провайдера.</w:t>
             </w:r>
           </w:p>
         </w:tc>
@@ -2454,7 +2308,7 @@
                 <w:b w:val="false"/>
                 <w:bCs w:val="false"/>
               </w:rPr>
-              <w:t xml:space="preserve">Выпустить работающую версию (MVP) до окончания учебного семестра и показать её на защите проекта.</w:t>
+              <w:t xml:space="preserve">Завоевать доверие пользователей приватностью: личный контент виден только друзьям — это отличает продукт от публичных соцсетей.</w:t>
             </w:r>
           </w:p>
         </w:tc>
@@ -2517,7 +2371,7 @@
                 <w:b w:val="false"/>
                 <w:bCs w:val="false"/>
               </w:rPr>
-              <w:t xml:space="preserve">Снизить зависимость от одного поставщика карт: сервис должен продолжать работать при недоступности любого одного картографического провайдера.</w:t>
+              <w:t xml:space="preserve">Сделать сервис доступным с любого устройства без установки приложения (через браузер телефона или компьютера), чтобы снизить порог входа.</w:t>
             </w:r>
           </w:p>
         </w:tc>
@@ -2552,321 +2406,6 @@
                 <w:bCs/>
               </w:rPr>
               <w:t xml:space="preserve">БТ-10</w:t>
-            </w:r>
-          </w:p>
-        </w:tc>
-        <w:tc>
-          <w:tcPr>
-            <w:tcW w:type="dxa" w:w="8538"/>
-            <w:tcBorders>
-              <w:top w:val="single" w:color="BFBFBF" w:sz="4"/>
-              <w:left w:val="single" w:color="BFBFBF" w:sz="4"/>
-              <w:bottom w:val="single" w:color="BFBFBF" w:sz="4"/>
-              <w:right w:val="single" w:color="BFBFBF" w:sz="4"/>
-            </w:tcBorders>
-            <w:tcMar>
-              <w:top w:type="dxa" w:w="60"/>
-              <w:left w:type="dxa" w:w="100"/>
-              <w:bottom w:type="dxa" w:w="60"/>
-              <w:right w:type="dxa" w:w="100"/>
-            </w:tcMar>
-          </w:tcPr>
-          <w:p>
-            <w:pPr>
-              <w:jc w:val="left"/>
-            </w:pPr>
-            <w:r>
-              <w:rPr>
-                <w:b w:val="false"/>
-                <w:bCs w:val="false"/>
-              </w:rPr>
-              <w:t xml:space="preserve">Завоевать доверие пользователей приватностью: личный контент виден только друзьям — это отличает продукт от публичных соцсетей.</w:t>
-            </w:r>
-          </w:p>
-        </w:tc>
-      </w:tr>
-      <w:tr>
-        <w:trPr>
-          <w:cantSplit/>
-        </w:trPr>
-        <w:tc>
-          <w:tcPr>
-            <w:tcW w:type="dxa" w:w="1100"/>
-            <w:tcBorders>
-              <w:top w:val="single" w:color="BFBFBF" w:sz="4"/>
-              <w:left w:val="single" w:color="BFBFBF" w:sz="4"/>
-              <w:bottom w:val="single" w:color="BFBFBF" w:sz="4"/>
-              <w:right w:val="single" w:color="BFBFBF" w:sz="4"/>
-            </w:tcBorders>
-            <w:tcMar>
-              <w:top w:type="dxa" w:w="60"/>
-              <w:left w:type="dxa" w:w="100"/>
-              <w:bottom w:type="dxa" w:w="60"/>
-              <w:right w:type="dxa" w:w="100"/>
-            </w:tcMar>
-          </w:tcPr>
-          <w:p>
-            <w:pPr>
-              <w:jc w:val="center"/>
-            </w:pPr>
-            <w:r>
-              <w:rPr>
-                <w:b/>
-                <w:bCs/>
-              </w:rPr>
-              <w:t xml:space="preserve">БТ-11</w:t>
-            </w:r>
-          </w:p>
-        </w:tc>
-        <w:tc>
-          <w:tcPr>
-            <w:tcW w:type="dxa" w:w="8538"/>
-            <w:tcBorders>
-              <w:top w:val="single" w:color="BFBFBF" w:sz="4"/>
-              <w:left w:val="single" w:color="BFBFBF" w:sz="4"/>
-              <w:bottom w:val="single" w:color="BFBFBF" w:sz="4"/>
-              <w:right w:val="single" w:color="BFBFBF" w:sz="4"/>
-            </w:tcBorders>
-            <w:tcMar>
-              <w:top w:type="dxa" w:w="60"/>
-              <w:left w:type="dxa" w:w="100"/>
-              <w:bottom w:type="dxa" w:w="60"/>
-              <w:right w:type="dxa" w:w="100"/>
-            </w:tcMar>
-          </w:tcPr>
-          <w:p>
-            <w:pPr>
-              <w:jc w:val="left"/>
-            </w:pPr>
-            <w:r>
-              <w:rPr>
-                <w:b w:val="false"/>
-                <w:bCs w:val="false"/>
-              </w:rPr>
-              <w:t xml:space="preserve">Сделать сервис доступным с любого устройства без установки приложения (через браузер телефона или компьютера), чтобы снизить порог входа.</w:t>
-            </w:r>
-          </w:p>
-        </w:tc>
-      </w:tr>
-      <w:tr>
-        <w:trPr>
-          <w:cantSplit/>
-        </w:trPr>
-        <w:tc>
-          <w:tcPr>
-            <w:tcW w:type="dxa" w:w="1100"/>
-            <w:tcBorders>
-              <w:top w:val="single" w:color="BFBFBF" w:sz="4"/>
-              <w:left w:val="single" w:color="BFBFBF" w:sz="4"/>
-              <w:bottom w:val="single" w:color="BFBFBF" w:sz="4"/>
-              <w:right w:val="single" w:color="BFBFBF" w:sz="4"/>
-            </w:tcBorders>
-            <w:tcMar>
-              <w:top w:type="dxa" w:w="60"/>
-              <w:left w:type="dxa" w:w="100"/>
-              <w:bottom w:type="dxa" w:w="60"/>
-              <w:right w:type="dxa" w:w="100"/>
-            </w:tcMar>
-          </w:tcPr>
-          <w:p>
-            <w:pPr>
-              <w:jc w:val="center"/>
-            </w:pPr>
-            <w:r>
-              <w:rPr>
-                <w:b/>
-                <w:bCs/>
-              </w:rPr>
-              <w:t xml:space="preserve">БТ-12</w:t>
-            </w:r>
-          </w:p>
-        </w:tc>
-        <w:tc>
-          <w:tcPr>
-            <w:tcW w:type="dxa" w:w="8538"/>
-            <w:tcBorders>
-              <w:top w:val="single" w:color="BFBFBF" w:sz="4"/>
-              <w:left w:val="single" w:color="BFBFBF" w:sz="4"/>
-              <w:bottom w:val="single" w:color="BFBFBF" w:sz="4"/>
-              <w:right w:val="single" w:color="BFBFBF" w:sz="4"/>
-            </w:tcBorders>
-            <w:tcMar>
-              <w:top w:type="dxa" w:w="60"/>
-              <w:left w:type="dxa" w:w="100"/>
-              <w:bottom w:type="dxa" w:w="60"/>
-              <w:right w:type="dxa" w:w="100"/>
-            </w:tcMar>
-          </w:tcPr>
-          <w:p>
-            <w:pPr>
-              <w:jc w:val="left"/>
-            </w:pPr>
-            <w:r>
-              <w:rPr>
-                <w:b w:val="false"/>
-                <w:bCs w:val="false"/>
-              </w:rPr>
-              <w:t xml:space="preserve">Сократить время ведения дневника путешествий: отметка посещённого региона должна занимать не более 10 секунд.</w:t>
-            </w:r>
-          </w:p>
-        </w:tc>
-      </w:tr>
-      <w:tr>
-        <w:trPr>
-          <w:cantSplit/>
-        </w:trPr>
-        <w:tc>
-          <w:tcPr>
-            <w:tcW w:type="dxa" w:w="1100"/>
-            <w:tcBorders>
-              <w:top w:val="single" w:color="BFBFBF" w:sz="4"/>
-              <w:left w:val="single" w:color="BFBFBF" w:sz="4"/>
-              <w:bottom w:val="single" w:color="BFBFBF" w:sz="4"/>
-              <w:right w:val="single" w:color="BFBFBF" w:sz="4"/>
-            </w:tcBorders>
-            <w:tcMar>
-              <w:top w:type="dxa" w:w="60"/>
-              <w:left w:type="dxa" w:w="100"/>
-              <w:bottom w:type="dxa" w:w="60"/>
-              <w:right w:type="dxa" w:w="100"/>
-            </w:tcMar>
-          </w:tcPr>
-          <w:p>
-            <w:pPr>
-              <w:jc w:val="center"/>
-            </w:pPr>
-            <w:r>
-              <w:rPr>
-                <w:b/>
-                <w:bCs/>
-              </w:rPr>
-              <w:t xml:space="preserve">БТ-13</w:t>
-            </w:r>
-          </w:p>
-        </w:tc>
-        <w:tc>
-          <w:tcPr>
-            <w:tcW w:type="dxa" w:w="8538"/>
-            <w:tcBorders>
-              <w:top w:val="single" w:color="BFBFBF" w:sz="4"/>
-              <w:left w:val="single" w:color="BFBFBF" w:sz="4"/>
-              <w:bottom w:val="single" w:color="BFBFBF" w:sz="4"/>
-              <w:right w:val="single" w:color="BFBFBF" w:sz="4"/>
-            </w:tcBorders>
-            <w:tcMar>
-              <w:top w:type="dxa" w:w="60"/>
-              <w:left w:type="dxa" w:w="100"/>
-              <w:bottom w:type="dxa" w:w="60"/>
-              <w:right w:type="dxa" w:w="100"/>
-            </w:tcMar>
-          </w:tcPr>
-          <w:p>
-            <w:pPr>
-              <w:jc w:val="left"/>
-            </w:pPr>
-            <w:r>
-              <w:rPr>
-                <w:b w:val="false"/>
-                <w:bCs w:val="false"/>
-              </w:rPr>
-              <w:t xml:space="preserve">Заложить основу для будущей монетизации (премиум-функции: экспорт карты, печать постера, расширенная статистика) без переделки базовой архитектуры.</w:t>
-            </w:r>
-          </w:p>
-        </w:tc>
-      </w:tr>
-      <w:tr>
-        <w:trPr>
-          <w:cantSplit/>
-        </w:trPr>
-        <w:tc>
-          <w:tcPr>
-            <w:tcW w:type="dxa" w:w="1100"/>
-            <w:tcBorders>
-              <w:top w:val="single" w:color="BFBFBF" w:sz="4"/>
-              <w:left w:val="single" w:color="BFBFBF" w:sz="4"/>
-              <w:bottom w:val="single" w:color="BFBFBF" w:sz="4"/>
-              <w:right w:val="single" w:color="BFBFBF" w:sz="4"/>
-            </w:tcBorders>
-            <w:tcMar>
-              <w:top w:type="dxa" w:w="60"/>
-              <w:left w:type="dxa" w:w="100"/>
-              <w:bottom w:type="dxa" w:w="60"/>
-              <w:right w:type="dxa" w:w="100"/>
-            </w:tcMar>
-          </w:tcPr>
-          <w:p>
-            <w:pPr>
-              <w:jc w:val="center"/>
-            </w:pPr>
-            <w:r>
-              <w:rPr>
-                <w:b/>
-                <w:bCs/>
-              </w:rPr>
-              <w:t xml:space="preserve">БТ-14</w:t>
-            </w:r>
-          </w:p>
-        </w:tc>
-        <w:tc>
-          <w:tcPr>
-            <w:tcW w:type="dxa" w:w="8538"/>
-            <w:tcBorders>
-              <w:top w:val="single" w:color="BFBFBF" w:sz="4"/>
-              <w:left w:val="single" w:color="BFBFBF" w:sz="4"/>
-              <w:bottom w:val="single" w:color="BFBFBF" w:sz="4"/>
-              <w:right w:val="single" w:color="BFBFBF" w:sz="4"/>
-            </w:tcBorders>
-            <w:tcMar>
-              <w:top w:type="dxa" w:w="60"/>
-              <w:left w:type="dxa" w:w="100"/>
-              <w:bottom w:type="dxa" w:w="60"/>
-              <w:right w:type="dxa" w:w="100"/>
-            </w:tcMar>
-          </w:tcPr>
-          <w:p>
-            <w:pPr>
-              <w:jc w:val="left"/>
-            </w:pPr>
-            <w:r>
-              <w:rPr>
-                <w:b w:val="false"/>
-                <w:bCs w:val="false"/>
-              </w:rPr>
-              <w:t xml:space="preserve">Накапливать обезличенную статистику популярности регионов для возможных партнёрств с туристическими организациями и региональными турцентрами.</w:t>
-            </w:r>
-          </w:p>
-        </w:tc>
-      </w:tr>
-      <w:tr>
-        <w:trPr>
-          <w:cantSplit/>
-        </w:trPr>
-        <w:tc>
-          <w:tcPr>
-            <w:tcW w:type="dxa" w:w="1100"/>
-            <w:tcBorders>
-              <w:top w:val="single" w:color="BFBFBF" w:sz="4"/>
-              <w:left w:val="single" w:color="BFBFBF" w:sz="4"/>
-              <w:bottom w:val="single" w:color="BFBFBF" w:sz="4"/>
-              <w:right w:val="single" w:color="BFBFBF" w:sz="4"/>
-            </w:tcBorders>
-            <w:tcMar>
-              <w:top w:type="dxa" w:w="60"/>
-              <w:left w:type="dxa" w:w="100"/>
-              <w:bottom w:type="dxa" w:w="60"/>
-              <w:right w:type="dxa" w:w="100"/>
-            </w:tcMar>
-          </w:tcPr>
-          <w:p>
-            <w:pPr>
-              <w:jc w:val="center"/>
-            </w:pPr>
-            <w:r>
-              <w:rPr>
-                <w:b/>
-                <w:bCs/>
-              </w:rPr>
-              <w:t xml:space="preserve">БТ-15</w:t>
             </w:r>
           </w:p>
         </w:tc>
@@ -3633,322 +3172,7 @@
                 <w:b w:val="false"/>
                 <w:bCs w:val="false"/>
               </w:rPr>
-              <w:t xml:space="preserve">На запрос восстановления пароля система отвечает одинаково независимо от того, зарегистрирован ли email, — чтобы не раскрывать наличие аккаунта.</w:t>
-            </w:r>
-          </w:p>
-        </w:tc>
-      </w:tr>
-      <w:tr>
-        <w:trPr>
-          <w:cantSplit/>
-        </w:trPr>
-        <w:tc>
-          <w:tcPr>
-            <w:tcW w:type="dxa" w:w="1100"/>
-            <w:tcBorders>
-              <w:top w:val="single" w:color="BFBFBF" w:sz="4"/>
-              <w:left w:val="single" w:color="BFBFBF" w:sz="4"/>
-              <w:bottom w:val="single" w:color="BFBFBF" w:sz="4"/>
-              <w:right w:val="single" w:color="BFBFBF" w:sz="4"/>
-            </w:tcBorders>
-            <w:tcMar>
-              <w:top w:type="dxa" w:w="60"/>
-              <w:left w:type="dxa" w:w="100"/>
-              <w:bottom w:type="dxa" w:w="60"/>
-              <w:right w:type="dxa" w:w="100"/>
-            </w:tcMar>
-          </w:tcPr>
-          <w:p>
-            <w:pPr>
-              <w:jc w:val="center"/>
-            </w:pPr>
-            <w:r>
-              <w:rPr>
-                <w:b/>
-                <w:bCs/>
-              </w:rPr>
-              <w:t xml:space="preserve">БП-11</w:t>
-            </w:r>
-          </w:p>
-        </w:tc>
-        <w:tc>
-          <w:tcPr>
-            <w:tcW w:type="dxa" w:w="8538"/>
-            <w:tcBorders>
-              <w:top w:val="single" w:color="BFBFBF" w:sz="4"/>
-              <w:left w:val="single" w:color="BFBFBF" w:sz="4"/>
-              <w:bottom w:val="single" w:color="BFBFBF" w:sz="4"/>
-              <w:right w:val="single" w:color="BFBFBF" w:sz="4"/>
-            </w:tcBorders>
-            <w:tcMar>
-              <w:top w:type="dxa" w:w="60"/>
-              <w:left w:type="dxa" w:w="100"/>
-              <w:bottom w:type="dxa" w:w="60"/>
-              <w:right w:type="dxa" w:w="100"/>
-            </w:tcMar>
-          </w:tcPr>
-          <w:p>
-            <w:pPr>
-              <w:jc w:val="left"/>
-            </w:pPr>
-            <w:r>
-              <w:rPr>
-                <w:b w:val="false"/>
-                <w:bCs w:val="false"/>
-              </w:rPr>
               <w:t xml:space="preserve">Цвет новой отметки региона по умолчанию берётся из цвета карты в профиле пользователя; если цвет не задан — используется синий (#3b82f6).</w:t>
-            </w:r>
-          </w:p>
-        </w:tc>
-      </w:tr>
-      <w:tr>
-        <w:trPr>
-          <w:cantSplit/>
-        </w:trPr>
-        <w:tc>
-          <w:tcPr>
-            <w:tcW w:type="dxa" w:w="1100"/>
-            <w:tcBorders>
-              <w:top w:val="single" w:color="BFBFBF" w:sz="4"/>
-              <w:left w:val="single" w:color="BFBFBF" w:sz="4"/>
-              <w:bottom w:val="single" w:color="BFBFBF" w:sz="4"/>
-              <w:right w:val="single" w:color="BFBFBF" w:sz="4"/>
-            </w:tcBorders>
-            <w:tcMar>
-              <w:top w:type="dxa" w:w="60"/>
-              <w:left w:type="dxa" w:w="100"/>
-              <w:bottom w:type="dxa" w:w="60"/>
-              <w:right w:type="dxa" w:w="100"/>
-            </w:tcMar>
-          </w:tcPr>
-          <w:p>
-            <w:pPr>
-              <w:jc w:val="center"/>
-            </w:pPr>
-            <w:r>
-              <w:rPr>
-                <w:b/>
-                <w:bCs/>
-              </w:rPr>
-              <w:t xml:space="preserve">БП-12</w:t>
-            </w:r>
-          </w:p>
-        </w:tc>
-        <w:tc>
-          <w:tcPr>
-            <w:tcW w:type="dxa" w:w="8538"/>
-            <w:tcBorders>
-              <w:top w:val="single" w:color="BFBFBF" w:sz="4"/>
-              <w:left w:val="single" w:color="BFBFBF" w:sz="4"/>
-              <w:bottom w:val="single" w:color="BFBFBF" w:sz="4"/>
-              <w:right w:val="single" w:color="BFBFBF" w:sz="4"/>
-            </w:tcBorders>
-            <w:tcMar>
-              <w:top w:type="dxa" w:w="60"/>
-              <w:left w:type="dxa" w:w="100"/>
-              <w:bottom w:type="dxa" w:w="60"/>
-              <w:right w:type="dxa" w:w="100"/>
-            </w:tcMar>
-          </w:tcPr>
-          <w:p>
-            <w:pPr>
-              <w:jc w:val="left"/>
-            </w:pPr>
-            <w:r>
-              <w:rPr>
-                <w:b w:val="false"/>
-                <w:bCs w:val="false"/>
-              </w:rPr>
-              <w:t xml:space="preserve">При удалении дружбы удаляются связанные уведомления о заявке, а доступ к контенту бывшего друга сразу закрывается.</w:t>
-            </w:r>
-          </w:p>
-        </w:tc>
-      </w:tr>
-      <w:tr>
-        <w:trPr>
-          <w:cantSplit/>
-        </w:trPr>
-        <w:tc>
-          <w:tcPr>
-            <w:tcW w:type="dxa" w:w="1100"/>
-            <w:tcBorders>
-              <w:top w:val="single" w:color="BFBFBF" w:sz="4"/>
-              <w:left w:val="single" w:color="BFBFBF" w:sz="4"/>
-              <w:bottom w:val="single" w:color="BFBFBF" w:sz="4"/>
-              <w:right w:val="single" w:color="BFBFBF" w:sz="4"/>
-            </w:tcBorders>
-            <w:tcMar>
-              <w:top w:type="dxa" w:w="60"/>
-              <w:left w:type="dxa" w:w="100"/>
-              <w:bottom w:type="dxa" w:w="60"/>
-              <w:right w:type="dxa" w:w="100"/>
-            </w:tcMar>
-          </w:tcPr>
-          <w:p>
-            <w:pPr>
-              <w:jc w:val="center"/>
-            </w:pPr>
-            <w:r>
-              <w:rPr>
-                <w:b/>
-                <w:bCs/>
-              </w:rPr>
-              <w:t xml:space="preserve">БП-13</w:t>
-            </w:r>
-          </w:p>
-        </w:tc>
-        <w:tc>
-          <w:tcPr>
-            <w:tcW w:type="dxa" w:w="8538"/>
-            <w:tcBorders>
-              <w:top w:val="single" w:color="BFBFBF" w:sz="4"/>
-              <w:left w:val="single" w:color="BFBFBF" w:sz="4"/>
-              <w:bottom w:val="single" w:color="BFBFBF" w:sz="4"/>
-              <w:right w:val="single" w:color="BFBFBF" w:sz="4"/>
-            </w:tcBorders>
-            <w:tcMar>
-              <w:top w:type="dxa" w:w="60"/>
-              <w:left w:type="dxa" w:w="100"/>
-              <w:bottom w:type="dxa" w:w="60"/>
-              <w:right w:type="dxa" w:w="100"/>
-            </w:tcMar>
-          </w:tcPr>
-          <w:p>
-            <w:pPr>
-              <w:jc w:val="left"/>
-            </w:pPr>
-            <w:r>
-              <w:rPr>
-                <w:b w:val="false"/>
-                <w:bCs w:val="false"/>
-              </w:rPr>
-              <w:t xml:space="preserve">При удалении аккаунта удаляются все данные пользователя: отметки, точки, истории, фото, дружбы и уведомления.</w:t>
-            </w:r>
-          </w:p>
-        </w:tc>
-      </w:tr>
-      <w:tr>
-        <w:trPr>
-          <w:cantSplit/>
-        </w:trPr>
-        <w:tc>
-          <w:tcPr>
-            <w:tcW w:type="dxa" w:w="1100"/>
-            <w:tcBorders>
-              <w:top w:val="single" w:color="BFBFBF" w:sz="4"/>
-              <w:left w:val="single" w:color="BFBFBF" w:sz="4"/>
-              <w:bottom w:val="single" w:color="BFBFBF" w:sz="4"/>
-              <w:right w:val="single" w:color="BFBFBF" w:sz="4"/>
-            </w:tcBorders>
-            <w:tcMar>
-              <w:top w:type="dxa" w:w="60"/>
-              <w:left w:type="dxa" w:w="100"/>
-              <w:bottom w:type="dxa" w:w="60"/>
-              <w:right w:type="dxa" w:w="100"/>
-            </w:tcMar>
-          </w:tcPr>
-          <w:p>
-            <w:pPr>
-              <w:jc w:val="center"/>
-            </w:pPr>
-            <w:r>
-              <w:rPr>
-                <w:b/>
-                <w:bCs/>
-              </w:rPr>
-              <w:t xml:space="preserve">БП-14</w:t>
-            </w:r>
-          </w:p>
-        </w:tc>
-        <w:tc>
-          <w:tcPr>
-            <w:tcW w:type="dxa" w:w="8538"/>
-            <w:tcBorders>
-              <w:top w:val="single" w:color="BFBFBF" w:sz="4"/>
-              <w:left w:val="single" w:color="BFBFBF" w:sz="4"/>
-              <w:bottom w:val="single" w:color="BFBFBF" w:sz="4"/>
-              <w:right w:val="single" w:color="BFBFBF" w:sz="4"/>
-            </w:tcBorders>
-            <w:tcMar>
-              <w:top w:type="dxa" w:w="60"/>
-              <w:left w:type="dxa" w:w="100"/>
-              <w:bottom w:type="dxa" w:w="60"/>
-              <w:right w:type="dxa" w:w="100"/>
-            </w:tcMar>
-          </w:tcPr>
-          <w:p>
-            <w:pPr>
-              <w:jc w:val="left"/>
-            </w:pPr>
-            <w:r>
-              <w:rPr>
-                <w:b w:val="false"/>
-                <w:bCs w:val="false"/>
-              </w:rPr>
-              <w:t xml:space="preserve">При удалении истории или точки прикреплённые к ним фото не удаляются, а остаются в общей галерее пользователя.</w:t>
-            </w:r>
-          </w:p>
-        </w:tc>
-      </w:tr>
-      <w:tr>
-        <w:trPr>
-          <w:cantSplit/>
-        </w:trPr>
-        <w:tc>
-          <w:tcPr>
-            <w:tcW w:type="dxa" w:w="1100"/>
-            <w:tcBorders>
-              <w:top w:val="single" w:color="BFBFBF" w:sz="4"/>
-              <w:left w:val="single" w:color="BFBFBF" w:sz="4"/>
-              <w:bottom w:val="single" w:color="BFBFBF" w:sz="4"/>
-              <w:right w:val="single" w:color="BFBFBF" w:sz="4"/>
-            </w:tcBorders>
-            <w:tcMar>
-              <w:top w:type="dxa" w:w="60"/>
-              <w:left w:type="dxa" w:w="100"/>
-              <w:bottom w:type="dxa" w:w="60"/>
-              <w:right w:type="dxa" w:w="100"/>
-            </w:tcMar>
-          </w:tcPr>
-          <w:p>
-            <w:pPr>
-              <w:jc w:val="center"/>
-            </w:pPr>
-            <w:r>
-              <w:rPr>
-                <w:b/>
-                <w:bCs/>
-              </w:rPr>
-              <w:t xml:space="preserve">БП-15</w:t>
-            </w:r>
-          </w:p>
-        </w:tc>
-        <w:tc>
-          <w:tcPr>
-            <w:tcW w:type="dxa" w:w="8538"/>
-            <w:tcBorders>
-              <w:top w:val="single" w:color="BFBFBF" w:sz="4"/>
-              <w:left w:val="single" w:color="BFBFBF" w:sz="4"/>
-              <w:bottom w:val="single" w:color="BFBFBF" w:sz="4"/>
-              <w:right w:val="single" w:color="BFBFBF" w:sz="4"/>
-            </w:tcBorders>
-            <w:tcMar>
-              <w:top w:type="dxa" w:w="60"/>
-              <w:left w:type="dxa" w:w="100"/>
-              <w:bottom w:type="dxa" w:w="60"/>
-              <w:right w:type="dxa" w:w="100"/>
-            </w:tcMar>
-          </w:tcPr>
-          <w:p>
-            <w:pPr>
-              <w:jc w:val="left"/>
-            </w:pPr>
-            <w:r>
-              <w:rPr>
-                <w:b w:val="false"/>
-                <w:bCs w:val="false"/>
-              </w:rPr>
-              <w:t xml:space="preserve">Уведомление о заявке в друзья не дублируется: пока предыдущее уведомление от того же отправителя не прочитано, новое не создаётся.</w:t>
             </w:r>
           </w:p>
         </w:tc>
@@ -4371,7 +3595,7 @@
                 <w:b w:val="false"/>
                 <w:bCs w:val="false"/>
               </w:rPr>
-              <w:t xml:space="preserve">Поиск мест выполняется только через внешние API (Яндекс Геокодер, Mapbox, Photon, Nominatim) с соблюдением их лимитов и условий использования (в том числе обязательный User-Agent для Nominatim).</w:t>
+              <w:t xml:space="preserve">География ограничена территорией России: поддерживаются только субъекты РФ, другие страны в MVP не поддерживаются.</w:t>
             </w:r>
           </w:p>
         </w:tc>
@@ -4434,7 +3658,7 @@
                 <w:b w:val="false"/>
                 <w:bCs w:val="false"/>
               </w:rPr>
-              <w:t xml:space="preserve">География ограничена территорией России: поддерживаются только субъекты РФ, другие страны в MVP не поддерживаются.</w:t>
+              <w:t xml:space="preserve">Язык интерфейса — только русский.</w:t>
             </w:r>
           </w:p>
         </w:tc>
@@ -4497,7 +3721,7 @@
                 <w:b w:val="false"/>
                 <w:bCs w:val="false"/>
               </w:rPr>
-              <w:t xml:space="preserve">Язык интерфейса — только русский.</w:t>
+              <w:t xml:space="preserve">Только веб-клиент: нативные мобильные приложения для iOS и Android в рамках проекта не разрабатываются.</w:t>
             </w:r>
           </w:p>
         </w:tc>
@@ -4560,7 +3784,7 @@
                 <w:b w:val="false"/>
                 <w:bCs w:val="false"/>
               </w:rPr>
-              <w:t xml:space="preserve">Только веб-клиент: нативные мобильные приложения для iOS и Android в рамках проекта не разрабатываются.</w:t>
+              <w:t xml:space="preserve">Максимальный размер одного загружаемого файла — 200 МБ, одного запроса — 250 МБ.</w:t>
             </w:r>
           </w:p>
         </w:tc>
@@ -4623,7 +3847,7 @@
                 <w:b w:val="false"/>
                 <w:bCs w:val="false"/>
               </w:rPr>
-              <w:t xml:space="preserve">Максимальный размер одного загружаемого файла — 200 МБ, одного запроса — 250 МБ.</w:t>
+              <w:t xml:space="preserve">Допустимые форматы медиа: фото — JPEG, PNG, WebP, GIF; видео — MP4, WebM, MOV. Для аватара — только изображения.</w:t>
             </w:r>
           </w:p>
         </w:tc>
@@ -4658,321 +3882,6 @@
                 <w:bCs/>
               </w:rPr>
               <w:t xml:space="preserve">ОГР-10</w:t>
-            </w:r>
-          </w:p>
-        </w:tc>
-        <w:tc>
-          <w:tcPr>
-            <w:tcW w:type="dxa" w:w="8538"/>
-            <w:tcBorders>
-              <w:top w:val="single" w:color="BFBFBF" w:sz="4"/>
-              <w:left w:val="single" w:color="BFBFBF" w:sz="4"/>
-              <w:bottom w:val="single" w:color="BFBFBF" w:sz="4"/>
-              <w:right w:val="single" w:color="BFBFBF" w:sz="4"/>
-            </w:tcBorders>
-            <w:tcMar>
-              <w:top w:type="dxa" w:w="60"/>
-              <w:left w:type="dxa" w:w="100"/>
-              <w:bottom w:type="dxa" w:w="60"/>
-              <w:right w:type="dxa" w:w="100"/>
-            </w:tcMar>
-          </w:tcPr>
-          <w:p>
-            <w:pPr>
-              <w:jc w:val="left"/>
-            </w:pPr>
-            <w:r>
-              <w:rPr>
-                <w:b w:val="false"/>
-                <w:bCs w:val="false"/>
-              </w:rPr>
-              <w:t xml:space="preserve">Допустимые форматы медиа: фото — JPEG, PNG, WebP, GIF; видео — MP4, WebM, MOV. Для аватара — только изображения.</w:t>
-            </w:r>
-          </w:p>
-        </w:tc>
-      </w:tr>
-      <w:tr>
-        <w:trPr>
-          <w:cantSplit/>
-        </w:trPr>
-        <w:tc>
-          <w:tcPr>
-            <w:tcW w:type="dxa" w:w="1100"/>
-            <w:tcBorders>
-              <w:top w:val="single" w:color="BFBFBF" w:sz="4"/>
-              <w:left w:val="single" w:color="BFBFBF" w:sz="4"/>
-              <w:bottom w:val="single" w:color="BFBFBF" w:sz="4"/>
-              <w:right w:val="single" w:color="BFBFBF" w:sz="4"/>
-            </w:tcBorders>
-            <w:tcMar>
-              <w:top w:type="dxa" w:w="60"/>
-              <w:left w:type="dxa" w:w="100"/>
-              <w:bottom w:type="dxa" w:w="60"/>
-              <w:right w:type="dxa" w:w="100"/>
-            </w:tcMar>
-          </w:tcPr>
-          <w:p>
-            <w:pPr>
-              <w:jc w:val="center"/>
-            </w:pPr>
-            <w:r>
-              <w:rPr>
-                <w:b/>
-                <w:bCs/>
-              </w:rPr>
-              <w:t xml:space="preserve">ОГР-11</w:t>
-            </w:r>
-          </w:p>
-        </w:tc>
-        <w:tc>
-          <w:tcPr>
-            <w:tcW w:type="dxa" w:w="8538"/>
-            <w:tcBorders>
-              <w:top w:val="single" w:color="BFBFBF" w:sz="4"/>
-              <w:left w:val="single" w:color="BFBFBF" w:sz="4"/>
-              <w:bottom w:val="single" w:color="BFBFBF" w:sz="4"/>
-              <w:right w:val="single" w:color="BFBFBF" w:sz="4"/>
-            </w:tcBorders>
-            <w:tcMar>
-              <w:top w:type="dxa" w:w="60"/>
-              <w:left w:type="dxa" w:w="100"/>
-              <w:bottom w:type="dxa" w:w="60"/>
-              <w:right w:type="dxa" w:w="100"/>
-            </w:tcMar>
-          </w:tcPr>
-          <w:p>
-            <w:pPr>
-              <w:jc w:val="left"/>
-            </w:pPr>
-            <w:r>
-              <w:rPr>
-                <w:b w:val="false"/>
-                <w:bCs w:val="false"/>
-              </w:rPr>
-              <w:t xml:space="preserve">Ограничения длины полей: имя — до 100 символов, пароль — 8–100, название точки — до 25, заметка к точке — до 500, заметка к региону — до 1 000, заголовок истории — до 200 символов.</w:t>
-            </w:r>
-          </w:p>
-        </w:tc>
-      </w:tr>
-      <w:tr>
-        <w:trPr>
-          <w:cantSplit/>
-        </w:trPr>
-        <w:tc>
-          <w:tcPr>
-            <w:tcW w:type="dxa" w:w="1100"/>
-            <w:tcBorders>
-              <w:top w:val="single" w:color="BFBFBF" w:sz="4"/>
-              <w:left w:val="single" w:color="BFBFBF" w:sz="4"/>
-              <w:bottom w:val="single" w:color="BFBFBF" w:sz="4"/>
-              <w:right w:val="single" w:color="BFBFBF" w:sz="4"/>
-            </w:tcBorders>
-            <w:tcMar>
-              <w:top w:type="dxa" w:w="60"/>
-              <w:left w:type="dxa" w:w="100"/>
-              <w:bottom w:type="dxa" w:w="60"/>
-              <w:right w:type="dxa" w:w="100"/>
-            </w:tcMar>
-          </w:tcPr>
-          <w:p>
-            <w:pPr>
-              <w:jc w:val="center"/>
-            </w:pPr>
-            <w:r>
-              <w:rPr>
-                <w:b/>
-                <w:bCs/>
-              </w:rPr>
-              <w:t xml:space="preserve">ОГР-12</w:t>
-            </w:r>
-          </w:p>
-        </w:tc>
-        <w:tc>
-          <w:tcPr>
-            <w:tcW w:type="dxa" w:w="8538"/>
-            <w:tcBorders>
-              <w:top w:val="single" w:color="BFBFBF" w:sz="4"/>
-              <w:left w:val="single" w:color="BFBFBF" w:sz="4"/>
-              <w:bottom w:val="single" w:color="BFBFBF" w:sz="4"/>
-              <w:right w:val="single" w:color="BFBFBF" w:sz="4"/>
-            </w:tcBorders>
-            <w:tcMar>
-              <w:top w:type="dxa" w:w="60"/>
-              <w:left w:type="dxa" w:w="100"/>
-              <w:bottom w:type="dxa" w:w="60"/>
-              <w:right w:type="dxa" w:w="100"/>
-            </w:tcMar>
-          </w:tcPr>
-          <w:p>
-            <w:pPr>
-              <w:jc w:val="left"/>
-            </w:pPr>
-            <w:r>
-              <w:rPr>
-                <w:b w:val="false"/>
-                <w:bCs w:val="false"/>
-              </w:rPr>
-              <w:t xml:space="preserve">Медиафайлы хранятся в файловой системе сервера (Docker-том), а не в облачном объектном хранилище.</w:t>
-            </w:r>
-          </w:p>
-        </w:tc>
-      </w:tr>
-      <w:tr>
-        <w:trPr>
-          <w:cantSplit/>
-        </w:trPr>
-        <w:tc>
-          <w:tcPr>
-            <w:tcW w:type="dxa" w:w="1100"/>
-            <w:tcBorders>
-              <w:top w:val="single" w:color="BFBFBF" w:sz="4"/>
-              <w:left w:val="single" w:color="BFBFBF" w:sz="4"/>
-              <w:bottom w:val="single" w:color="BFBFBF" w:sz="4"/>
-              <w:right w:val="single" w:color="BFBFBF" w:sz="4"/>
-            </w:tcBorders>
-            <w:tcMar>
-              <w:top w:type="dxa" w:w="60"/>
-              <w:left w:type="dxa" w:w="100"/>
-              <w:bottom w:type="dxa" w:w="60"/>
-              <w:right w:type="dxa" w:w="100"/>
-            </w:tcMar>
-          </w:tcPr>
-          <w:p>
-            <w:pPr>
-              <w:jc w:val="center"/>
-            </w:pPr>
-            <w:r>
-              <w:rPr>
-                <w:b/>
-                <w:bCs/>
-              </w:rPr>
-              <w:t xml:space="preserve">ОГР-13</w:t>
-            </w:r>
-          </w:p>
-        </w:tc>
-        <w:tc>
-          <w:tcPr>
-            <w:tcW w:type="dxa" w:w="8538"/>
-            <w:tcBorders>
-              <w:top w:val="single" w:color="BFBFBF" w:sz="4"/>
-              <w:left w:val="single" w:color="BFBFBF" w:sz="4"/>
-              <w:bottom w:val="single" w:color="BFBFBF" w:sz="4"/>
-              <w:right w:val="single" w:color="BFBFBF" w:sz="4"/>
-            </w:tcBorders>
-            <w:tcMar>
-              <w:top w:type="dxa" w:w="60"/>
-              <w:left w:type="dxa" w:w="100"/>
-              <w:bottom w:type="dxa" w:w="60"/>
-              <w:right w:type="dxa" w:w="100"/>
-            </w:tcMar>
-          </w:tcPr>
-          <w:p>
-            <w:pPr>
-              <w:jc w:val="left"/>
-            </w:pPr>
-            <w:r>
-              <w:rPr>
-                <w:b w:val="false"/>
-                <w:bCs w:val="false"/>
-              </w:rPr>
-              <w:t xml:space="preserve">Развёртывание — Docker Compose на одном VPS: контейнер приложения (API и статика в одном JAR) и контейнер PostgreSQL.</w:t>
-            </w:r>
-          </w:p>
-        </w:tc>
-      </w:tr>
-      <w:tr>
-        <w:trPr>
-          <w:cantSplit/>
-        </w:trPr>
-        <w:tc>
-          <w:tcPr>
-            <w:tcW w:type="dxa" w:w="1100"/>
-            <w:tcBorders>
-              <w:top w:val="single" w:color="BFBFBF" w:sz="4"/>
-              <w:left w:val="single" w:color="BFBFBF" w:sz="4"/>
-              <w:bottom w:val="single" w:color="BFBFBF" w:sz="4"/>
-              <w:right w:val="single" w:color="BFBFBF" w:sz="4"/>
-            </w:tcBorders>
-            <w:tcMar>
-              <w:top w:type="dxa" w:w="60"/>
-              <w:left w:type="dxa" w:w="100"/>
-              <w:bottom w:type="dxa" w:w="60"/>
-              <w:right w:type="dxa" w:w="100"/>
-            </w:tcMar>
-          </w:tcPr>
-          <w:p>
-            <w:pPr>
-              <w:jc w:val="center"/>
-            </w:pPr>
-            <w:r>
-              <w:rPr>
-                <w:b/>
-                <w:bCs/>
-              </w:rPr>
-              <w:t xml:space="preserve">ОГР-14</w:t>
-            </w:r>
-          </w:p>
-        </w:tc>
-        <w:tc>
-          <w:tcPr>
-            <w:tcW w:type="dxa" w:w="8538"/>
-            <w:tcBorders>
-              <w:top w:val="single" w:color="BFBFBF" w:sz="4"/>
-              <w:left w:val="single" w:color="BFBFBF" w:sz="4"/>
-              <w:bottom w:val="single" w:color="BFBFBF" w:sz="4"/>
-              <w:right w:val="single" w:color="BFBFBF" w:sz="4"/>
-            </w:tcBorders>
-            <w:tcMar>
-              <w:top w:type="dxa" w:w="60"/>
-              <w:left w:type="dxa" w:w="100"/>
-              <w:bottom w:type="dxa" w:w="60"/>
-              <w:right w:type="dxa" w:w="100"/>
-            </w:tcMar>
-          </w:tcPr>
-          <w:p>
-            <w:pPr>
-              <w:jc w:val="left"/>
-            </w:pPr>
-            <w:r>
-              <w:rPr>
-                <w:b w:val="false"/>
-                <w:bCs w:val="false"/>
-              </w:rPr>
-              <w:t xml:space="preserve">Письма отправляются только через внешний SMTP-сервер (Яндекс Почта) и используются только для восстановления пароля.</w:t>
-            </w:r>
-          </w:p>
-        </w:tc>
-      </w:tr>
-      <w:tr>
-        <w:trPr>
-          <w:cantSplit/>
-        </w:trPr>
-        <w:tc>
-          <w:tcPr>
-            <w:tcW w:type="dxa" w:w="1100"/>
-            <w:tcBorders>
-              <w:top w:val="single" w:color="BFBFBF" w:sz="4"/>
-              <w:left w:val="single" w:color="BFBFBF" w:sz="4"/>
-              <w:bottom w:val="single" w:color="BFBFBF" w:sz="4"/>
-              <w:right w:val="single" w:color="BFBFBF" w:sz="4"/>
-            </w:tcBorders>
-            <w:tcMar>
-              <w:top w:type="dxa" w:w="60"/>
-              <w:left w:type="dxa" w:w="100"/>
-              <w:bottom w:type="dxa" w:w="60"/>
-              <w:right w:type="dxa" w:w="100"/>
-            </w:tcMar>
-          </w:tcPr>
-          <w:p>
-            <w:pPr>
-              <w:jc w:val="center"/>
-            </w:pPr>
-            <w:r>
-              <w:rPr>
-                <w:b/>
-                <w:bCs/>
-              </w:rPr>
-              <w:t xml:space="preserve">ОГР-15</w:t>
             </w:r>
           </w:p>
         </w:tc>
@@ -5203,7 +4112,7 @@
                 <w:b w:val="false"/>
                 <w:bCs w:val="false"/>
               </w:rPr>
-              <w:t xml:space="preserve">Система должна позволять гостю зарегистрироваться, указав email, пароль (8–100 символов) и отображаемое имя (до 100 символов), и сразу авторизовать его.</w:t>
+              <w:t xml:space="preserve">Система должна позволять гостю зарегистрироваться (email, пароль 8–100 символов, имя до 100 символов) и войти по email и паролю; при ошибке входа — показывать общее сообщение о неверных данных, не уточняя, что именно неверно.</w:t>
             </w:r>
           </w:p>
         </w:tc>
@@ -5295,7 +4204,7 @@
                 <w:b w:val="false"/>
                 <w:bCs w:val="false"/>
               </w:rPr>
-              <w:t xml:space="preserve">Система должна позволять пользователю войти по email и паролю; при ошибке — показывать общее сообщение о неверных данных, не уточняя, что именно неверно.</w:t>
+              <w:t xml:space="preserve">Система должна позволять восстановить пароль: отправить 6-значный код на email, принять код и новый пароль и сразу авторизовать пользователя.</w:t>
             </w:r>
           </w:p>
         </w:tc>
@@ -5387,7 +4296,7 @@
                 <w:b w:val="false"/>
                 <w:bCs w:val="false"/>
               </w:rPr>
-              <w:t xml:space="preserve">Система должна позволять восстановить пароль: отправить 6-значный код на email, принять код и новый пароль и сразу авторизовать пользователя.</w:t>
+              <w:t xml:space="preserve">Система должна отображать интерактивную карту России с границами всех 89 субъектов и позволять отметить регион посещённым (с необязательными датой и заметкой), снять отметку и выбрать цвет заливки региона.</w:t>
             </w:r>
           </w:p>
         </w:tc>
@@ -5479,7 +4388,7 @@
                 <w:b w:val="false"/>
                 <w:bCs w:val="false"/>
               </w:rPr>
-              <w:t xml:space="preserve">Система должна отображать интерактивную карту России с границами всех 89 субъектов, с возможностью масштабирования и перемещения.</w:t>
+              <w:t xml:space="preserve">Система должна выполнять поиск мест по названию (от 2 символов) и по координатам в формате «широта, долгота» и перемещать карту к выбранному результату.</w:t>
             </w:r>
           </w:p>
         </w:tc>
@@ -5571,7 +4480,7 @@
                 <w:b w:val="false"/>
                 <w:bCs w:val="false"/>
               </w:rPr>
-              <w:t xml:space="preserve">Система должна позволять отметить регион посещённым (с необязательными датой и заметкой) и снять отметку; посещённые регионы закрашиваются на карте.</w:t>
+              <w:t xml:space="preserve">Система должна позволять создать точку нажатием на карту, указать название и заметку, автоматически определить регион точки, а также редактировать и удалять точку.</w:t>
             </w:r>
           </w:p>
         </w:tc>
@@ -5663,7 +4572,7 @@
                 <w:b w:val="false"/>
                 <w:bCs w:val="false"/>
               </w:rPr>
-              <w:t xml:space="preserve">Система должна позволять выбрать цвет заливки для каждого посещённого региона и цвет карты по умолчанию в профиле.</w:t>
+              <w:t xml:space="preserve">Система должна позволять загружать несколько фото и видео за один раз с привязкой к точке, истории или региону, удалять их и просматривать в полноэкранной галерее; видео воспроизводится потоково с перемоткой.</w:t>
             </w:r>
           </w:p>
         </w:tc>
@@ -5692,6 +4601,190 @@
                 <w:b w:val="false"/>
                 <w:bCs w:val="false"/>
               </w:rPr>
+              <w:t xml:space="preserve">Высокий</w:t>
+            </w:r>
+          </w:p>
+        </w:tc>
+      </w:tr>
+      <w:tr>
+        <w:trPr>
+          <w:cantSplit/>
+        </w:trPr>
+        <w:tc>
+          <w:tcPr>
+            <w:tcW w:type="dxa" w:w="1100"/>
+            <w:tcBorders>
+              <w:top w:val="single" w:color="BFBFBF" w:sz="4"/>
+              <w:left w:val="single" w:color="BFBFBF" w:sz="4"/>
+              <w:bottom w:val="single" w:color="BFBFBF" w:sz="4"/>
+              <w:right w:val="single" w:color="BFBFBF" w:sz="4"/>
+            </w:tcBorders>
+            <w:tcMar>
+              <w:top w:type="dxa" w:w="60"/>
+              <w:left w:type="dxa" w:w="100"/>
+              <w:bottom w:type="dxa" w:w="60"/>
+              <w:right w:type="dxa" w:w="100"/>
+            </w:tcMar>
+          </w:tcPr>
+          <w:p>
+            <w:pPr>
+              <w:jc w:val="center"/>
+            </w:pPr>
+            <w:r>
+              <w:rPr>
+                <w:b/>
+                <w:bCs/>
+              </w:rPr>
+              <w:t xml:space="preserve">ФТ-07</w:t>
+            </w:r>
+          </w:p>
+        </w:tc>
+        <w:tc>
+          <w:tcPr>
+            <w:tcW w:type="dxa" w:w="7138"/>
+            <w:tcBorders>
+              <w:top w:val="single" w:color="BFBFBF" w:sz="4"/>
+              <w:left w:val="single" w:color="BFBFBF" w:sz="4"/>
+              <w:bottom w:val="single" w:color="BFBFBF" w:sz="4"/>
+              <w:right w:val="single" w:color="BFBFBF" w:sz="4"/>
+            </w:tcBorders>
+            <w:tcMar>
+              <w:top w:type="dxa" w:w="60"/>
+              <w:left w:type="dxa" w:w="100"/>
+              <w:bottom w:type="dxa" w:w="60"/>
+              <w:right w:type="dxa" w:w="100"/>
+            </w:tcMar>
+          </w:tcPr>
+          <w:p>
+            <w:pPr>
+              <w:jc w:val="left"/>
+            </w:pPr>
+            <w:r>
+              <w:rPr>
+                <w:b w:val="false"/>
+                <w:bCs w:val="false"/>
+              </w:rPr>
+              <w:t xml:space="preserve">Система должна позволять создавать, просматривать, редактировать и удалять истории (заголовок до 200 символов и текст) с привязкой к региону и/или точке, а также искать истории по словам и региону.</w:t>
+            </w:r>
+          </w:p>
+        </w:tc>
+        <w:tc>
+          <w:tcPr>
+            <w:tcW w:type="dxa" w:w="1400"/>
+            <w:tcBorders>
+              <w:top w:val="single" w:color="BFBFBF" w:sz="4"/>
+              <w:left w:val="single" w:color="BFBFBF" w:sz="4"/>
+              <w:bottom w:val="single" w:color="BFBFBF" w:sz="4"/>
+              <w:right w:val="single" w:color="BFBFBF" w:sz="4"/>
+            </w:tcBorders>
+            <w:tcMar>
+              <w:top w:type="dxa" w:w="60"/>
+              <w:left w:type="dxa" w:w="100"/>
+              <w:bottom w:type="dxa" w:w="60"/>
+              <w:right w:type="dxa" w:w="100"/>
+            </w:tcMar>
+          </w:tcPr>
+          <w:p>
+            <w:pPr>
+              <w:jc w:val="center"/>
+            </w:pPr>
+            <w:r>
+              <w:rPr>
+                <w:b w:val="false"/>
+                <w:bCs w:val="false"/>
+              </w:rPr>
+              <w:t xml:space="preserve">Высокий</w:t>
+            </w:r>
+          </w:p>
+        </w:tc>
+      </w:tr>
+      <w:tr>
+        <w:trPr>
+          <w:cantSplit/>
+        </w:trPr>
+        <w:tc>
+          <w:tcPr>
+            <w:tcW w:type="dxa" w:w="1100"/>
+            <w:tcBorders>
+              <w:top w:val="single" w:color="BFBFBF" w:sz="4"/>
+              <w:left w:val="single" w:color="BFBFBF" w:sz="4"/>
+              <w:bottom w:val="single" w:color="BFBFBF" w:sz="4"/>
+              <w:right w:val="single" w:color="BFBFBF" w:sz="4"/>
+            </w:tcBorders>
+            <w:tcMar>
+              <w:top w:type="dxa" w:w="60"/>
+              <w:left w:type="dxa" w:w="100"/>
+              <w:bottom w:type="dxa" w:w="60"/>
+              <w:right w:type="dxa" w:w="100"/>
+            </w:tcMar>
+          </w:tcPr>
+          <w:p>
+            <w:pPr>
+              <w:jc w:val="center"/>
+            </w:pPr>
+            <w:r>
+              <w:rPr>
+                <w:b/>
+                <w:bCs/>
+              </w:rPr>
+              <w:t xml:space="preserve">ФТ-08</w:t>
+            </w:r>
+          </w:p>
+        </w:tc>
+        <w:tc>
+          <w:tcPr>
+            <w:tcW w:type="dxa" w:w="7138"/>
+            <w:tcBorders>
+              <w:top w:val="single" w:color="BFBFBF" w:sz="4"/>
+              <w:left w:val="single" w:color="BFBFBF" w:sz="4"/>
+              <w:bottom w:val="single" w:color="BFBFBF" w:sz="4"/>
+              <w:right w:val="single" w:color="BFBFBF" w:sz="4"/>
+            </w:tcBorders>
+            <w:tcMar>
+              <w:top w:type="dxa" w:w="60"/>
+              <w:left w:type="dxa" w:w="100"/>
+              <w:bottom w:type="dxa" w:w="60"/>
+              <w:right w:type="dxa" w:w="100"/>
+            </w:tcMar>
+          </w:tcPr>
+          <w:p>
+            <w:pPr>
+              <w:jc w:val="left"/>
+            </w:pPr>
+            <w:r>
+              <w:rPr>
+                <w:b w:val="false"/>
+                <w:bCs w:val="false"/>
+              </w:rPr>
+              <w:t xml:space="preserve">Система должна позволять изменить имя, загрузить и удалить аватар, задать цвет карты по умолчанию и показывать статистику профиля: число посещённых регионов, историй и фото.</w:t>
+            </w:r>
+          </w:p>
+        </w:tc>
+        <w:tc>
+          <w:tcPr>
+            <w:tcW w:type="dxa" w:w="1400"/>
+            <w:tcBorders>
+              <w:top w:val="single" w:color="BFBFBF" w:sz="4"/>
+              <w:left w:val="single" w:color="BFBFBF" w:sz="4"/>
+              <w:bottom w:val="single" w:color="BFBFBF" w:sz="4"/>
+              <w:right w:val="single" w:color="BFBFBF" w:sz="4"/>
+            </w:tcBorders>
+            <w:tcMar>
+              <w:top w:type="dxa" w:w="60"/>
+              <w:left w:type="dxa" w:w="100"/>
+              <w:bottom w:type="dxa" w:w="60"/>
+              <w:right w:type="dxa" w:w="100"/>
+            </w:tcMar>
+          </w:tcPr>
+          <w:p>
+            <w:pPr>
+              <w:jc w:val="center"/>
+            </w:pPr>
+            <w:r>
+              <w:rPr>
+                <w:b w:val="false"/>
+                <w:bCs w:val="false"/>
+              </w:rPr>
               <w:t xml:space="preserve">Средний</w:t>
             </w:r>
           </w:p>
@@ -5726,7 +4819,7 @@
                 <w:b/>
                 <w:bCs/>
               </w:rPr>
-              <w:t xml:space="preserve">ФТ-07</w:t>
+              <w:t xml:space="preserve">ФТ-09</w:t>
             </w:r>
           </w:p>
         </w:tc>
@@ -5755,7 +4848,7 @@
                 <w:b w:val="false"/>
                 <w:bCs w:val="false"/>
               </w:rPr>
-              <w:t xml:space="preserve">Система должна выполнять поиск мест по названию (от 2 символов) и по координатам в формате «широта, долгота» и перемещать карту к выбранному результату.</w:t>
+              <w:t xml:space="preserve">Система должна позволять искать пользователей по имени или email, отправлять, принимать и отклонять заявки в друзья, удалять из друзей и просматривать карту, точки, истории и фото друга.</w:t>
             </w:r>
           </w:p>
         </w:tc>
@@ -5818,651 +4911,7 @@
                 <w:b/>
                 <w:bCs/>
               </w:rPr>
-              <w:t xml:space="preserve">ФТ-08</w:t>
-            </w:r>
-          </w:p>
-        </w:tc>
-        <w:tc>
-          <w:tcPr>
-            <w:tcW w:type="dxa" w:w="7138"/>
-            <w:tcBorders>
-              <w:top w:val="single" w:color="BFBFBF" w:sz="4"/>
-              <w:left w:val="single" w:color="BFBFBF" w:sz="4"/>
-              <w:bottom w:val="single" w:color="BFBFBF" w:sz="4"/>
-              <w:right w:val="single" w:color="BFBFBF" w:sz="4"/>
-            </w:tcBorders>
-            <w:tcMar>
-              <w:top w:type="dxa" w:w="60"/>
-              <w:left w:type="dxa" w:w="100"/>
-              <w:bottom w:type="dxa" w:w="60"/>
-              <w:right w:type="dxa" w:w="100"/>
-            </w:tcMar>
-          </w:tcPr>
-          <w:p>
-            <w:pPr>
-              <w:jc w:val="left"/>
-            </w:pPr>
-            <w:r>
-              <w:rPr>
-                <w:b w:val="false"/>
-                <w:bCs w:val="false"/>
-              </w:rPr>
-              <w:t xml:space="preserve">Система должна позволять создать точку нажатием на карту, указать название и заметку, автоматически определить регион точки, а также редактировать и удалять точку.</w:t>
-            </w:r>
-          </w:p>
-        </w:tc>
-        <w:tc>
-          <w:tcPr>
-            <w:tcW w:type="dxa" w:w="1400"/>
-            <w:tcBorders>
-              <w:top w:val="single" w:color="BFBFBF" w:sz="4"/>
-              <w:left w:val="single" w:color="BFBFBF" w:sz="4"/>
-              <w:bottom w:val="single" w:color="BFBFBF" w:sz="4"/>
-              <w:right w:val="single" w:color="BFBFBF" w:sz="4"/>
-            </w:tcBorders>
-            <w:tcMar>
-              <w:top w:type="dxa" w:w="60"/>
-              <w:left w:type="dxa" w:w="100"/>
-              <w:bottom w:type="dxa" w:w="60"/>
-              <w:right w:type="dxa" w:w="100"/>
-            </w:tcMar>
-          </w:tcPr>
-          <w:p>
-            <w:pPr>
-              <w:jc w:val="center"/>
-            </w:pPr>
-            <w:r>
-              <w:rPr>
-                <w:b w:val="false"/>
-                <w:bCs w:val="false"/>
-              </w:rPr>
-              <w:t xml:space="preserve">Высокий</w:t>
-            </w:r>
-          </w:p>
-        </w:tc>
-      </w:tr>
-      <w:tr>
-        <w:trPr>
-          <w:cantSplit/>
-        </w:trPr>
-        <w:tc>
-          <w:tcPr>
-            <w:tcW w:type="dxa" w:w="1100"/>
-            <w:tcBorders>
-              <w:top w:val="single" w:color="BFBFBF" w:sz="4"/>
-              <w:left w:val="single" w:color="BFBFBF" w:sz="4"/>
-              <w:bottom w:val="single" w:color="BFBFBF" w:sz="4"/>
-              <w:right w:val="single" w:color="BFBFBF" w:sz="4"/>
-            </w:tcBorders>
-            <w:tcMar>
-              <w:top w:type="dxa" w:w="60"/>
-              <w:left w:type="dxa" w:w="100"/>
-              <w:bottom w:type="dxa" w:w="60"/>
-              <w:right w:type="dxa" w:w="100"/>
-            </w:tcMar>
-          </w:tcPr>
-          <w:p>
-            <w:pPr>
-              <w:jc w:val="center"/>
-            </w:pPr>
-            <w:r>
-              <w:rPr>
-                <w:b/>
-                <w:bCs/>
-              </w:rPr>
-              <w:t xml:space="preserve">ФТ-09</w:t>
-            </w:r>
-          </w:p>
-        </w:tc>
-        <w:tc>
-          <w:tcPr>
-            <w:tcW w:type="dxa" w:w="7138"/>
-            <w:tcBorders>
-              <w:top w:val="single" w:color="BFBFBF" w:sz="4"/>
-              <w:left w:val="single" w:color="BFBFBF" w:sz="4"/>
-              <w:bottom w:val="single" w:color="BFBFBF" w:sz="4"/>
-              <w:right w:val="single" w:color="BFBFBF" w:sz="4"/>
-            </w:tcBorders>
-            <w:tcMar>
-              <w:top w:type="dxa" w:w="60"/>
-              <w:left w:type="dxa" w:w="100"/>
-              <w:bottom w:type="dxa" w:w="60"/>
-              <w:right w:type="dxa" w:w="100"/>
-            </w:tcMar>
-          </w:tcPr>
-          <w:p>
-            <w:pPr>
-              <w:jc w:val="left"/>
-            </w:pPr>
-            <w:r>
-              <w:rPr>
-                <w:b w:val="false"/>
-                <w:bCs w:val="false"/>
-              </w:rPr>
-              <w:t xml:space="preserve">Система должна позволять загружать несколько фото и видео за один раз с привязкой к точке, истории или региону, а также удалять загруженные файлы.</w:t>
-            </w:r>
-          </w:p>
-        </w:tc>
-        <w:tc>
-          <w:tcPr>
-            <w:tcW w:type="dxa" w:w="1400"/>
-            <w:tcBorders>
-              <w:top w:val="single" w:color="BFBFBF" w:sz="4"/>
-              <w:left w:val="single" w:color="BFBFBF" w:sz="4"/>
-              <w:bottom w:val="single" w:color="BFBFBF" w:sz="4"/>
-              <w:right w:val="single" w:color="BFBFBF" w:sz="4"/>
-            </w:tcBorders>
-            <w:tcMar>
-              <w:top w:type="dxa" w:w="60"/>
-              <w:left w:type="dxa" w:w="100"/>
-              <w:bottom w:type="dxa" w:w="60"/>
-              <w:right w:type="dxa" w:w="100"/>
-            </w:tcMar>
-          </w:tcPr>
-          <w:p>
-            <w:pPr>
-              <w:jc w:val="center"/>
-            </w:pPr>
-            <w:r>
-              <w:rPr>
-                <w:b w:val="false"/>
-                <w:bCs w:val="false"/>
-              </w:rPr>
-              <w:t xml:space="preserve">Высокий</w:t>
-            </w:r>
-          </w:p>
-        </w:tc>
-      </w:tr>
-      <w:tr>
-        <w:trPr>
-          <w:cantSplit/>
-        </w:trPr>
-        <w:tc>
-          <w:tcPr>
-            <w:tcW w:type="dxa" w:w="1100"/>
-            <w:tcBorders>
-              <w:top w:val="single" w:color="BFBFBF" w:sz="4"/>
-              <w:left w:val="single" w:color="BFBFBF" w:sz="4"/>
-              <w:bottom w:val="single" w:color="BFBFBF" w:sz="4"/>
-              <w:right w:val="single" w:color="BFBFBF" w:sz="4"/>
-            </w:tcBorders>
-            <w:tcMar>
-              <w:top w:type="dxa" w:w="60"/>
-              <w:left w:type="dxa" w:w="100"/>
-              <w:bottom w:type="dxa" w:w="60"/>
-              <w:right w:type="dxa" w:w="100"/>
-            </w:tcMar>
-          </w:tcPr>
-          <w:p>
-            <w:pPr>
-              <w:jc w:val="center"/>
-            </w:pPr>
-            <w:r>
-              <w:rPr>
-                <w:b/>
-                <w:bCs/>
-              </w:rPr>
               <w:t xml:space="preserve">ФТ-10</w:t>
-            </w:r>
-          </w:p>
-        </w:tc>
-        <w:tc>
-          <w:tcPr>
-            <w:tcW w:type="dxa" w:w="7138"/>
-            <w:tcBorders>
-              <w:top w:val="single" w:color="BFBFBF" w:sz="4"/>
-              <w:left w:val="single" w:color="BFBFBF" w:sz="4"/>
-              <w:bottom w:val="single" w:color="BFBFBF" w:sz="4"/>
-              <w:right w:val="single" w:color="BFBFBF" w:sz="4"/>
-            </w:tcBorders>
-            <w:tcMar>
-              <w:top w:type="dxa" w:w="60"/>
-              <w:left w:type="dxa" w:w="100"/>
-              <w:bottom w:type="dxa" w:w="60"/>
-              <w:right w:type="dxa" w:w="100"/>
-            </w:tcMar>
-          </w:tcPr>
-          <w:p>
-            <w:pPr>
-              <w:jc w:val="left"/>
-            </w:pPr>
-            <w:r>
-              <w:rPr>
-                <w:b w:val="false"/>
-                <w:bCs w:val="false"/>
-              </w:rPr>
-              <w:t xml:space="preserve">Система должна показывать фото и видео в полноэкранной галерее с листанием; видео должно воспроизводиться потоково с возможностью перемотки.</w:t>
-            </w:r>
-          </w:p>
-        </w:tc>
-        <w:tc>
-          <w:tcPr>
-            <w:tcW w:type="dxa" w:w="1400"/>
-            <w:tcBorders>
-              <w:top w:val="single" w:color="BFBFBF" w:sz="4"/>
-              <w:left w:val="single" w:color="BFBFBF" w:sz="4"/>
-              <w:bottom w:val="single" w:color="BFBFBF" w:sz="4"/>
-              <w:right w:val="single" w:color="BFBFBF" w:sz="4"/>
-            </w:tcBorders>
-            <w:tcMar>
-              <w:top w:type="dxa" w:w="60"/>
-              <w:left w:type="dxa" w:w="100"/>
-              <w:bottom w:type="dxa" w:w="60"/>
-              <w:right w:type="dxa" w:w="100"/>
-            </w:tcMar>
-          </w:tcPr>
-          <w:p>
-            <w:pPr>
-              <w:jc w:val="center"/>
-            </w:pPr>
-            <w:r>
-              <w:rPr>
-                <w:b w:val="false"/>
-                <w:bCs w:val="false"/>
-              </w:rPr>
-              <w:t xml:space="preserve">Средний</w:t>
-            </w:r>
-          </w:p>
-        </w:tc>
-      </w:tr>
-      <w:tr>
-        <w:trPr>
-          <w:cantSplit/>
-        </w:trPr>
-        <w:tc>
-          <w:tcPr>
-            <w:tcW w:type="dxa" w:w="1100"/>
-            <w:tcBorders>
-              <w:top w:val="single" w:color="BFBFBF" w:sz="4"/>
-              <w:left w:val="single" w:color="BFBFBF" w:sz="4"/>
-              <w:bottom w:val="single" w:color="BFBFBF" w:sz="4"/>
-              <w:right w:val="single" w:color="BFBFBF" w:sz="4"/>
-            </w:tcBorders>
-            <w:tcMar>
-              <w:top w:type="dxa" w:w="60"/>
-              <w:left w:type="dxa" w:w="100"/>
-              <w:bottom w:type="dxa" w:w="60"/>
-              <w:right w:type="dxa" w:w="100"/>
-            </w:tcMar>
-          </w:tcPr>
-          <w:p>
-            <w:pPr>
-              <w:jc w:val="center"/>
-            </w:pPr>
-            <w:r>
-              <w:rPr>
-                <w:b/>
-                <w:bCs/>
-              </w:rPr>
-              <w:t xml:space="preserve">ФТ-11</w:t>
-            </w:r>
-          </w:p>
-        </w:tc>
-        <w:tc>
-          <w:tcPr>
-            <w:tcW w:type="dxa" w:w="7138"/>
-            <w:tcBorders>
-              <w:top w:val="single" w:color="BFBFBF" w:sz="4"/>
-              <w:left w:val="single" w:color="BFBFBF" w:sz="4"/>
-              <w:bottom w:val="single" w:color="BFBFBF" w:sz="4"/>
-              <w:right w:val="single" w:color="BFBFBF" w:sz="4"/>
-            </w:tcBorders>
-            <w:tcMar>
-              <w:top w:type="dxa" w:w="60"/>
-              <w:left w:type="dxa" w:w="100"/>
-              <w:bottom w:type="dxa" w:w="60"/>
-              <w:right w:type="dxa" w:w="100"/>
-            </w:tcMar>
-          </w:tcPr>
-          <w:p>
-            <w:pPr>
-              <w:jc w:val="left"/>
-            </w:pPr>
-            <w:r>
-              <w:rPr>
-                <w:b w:val="false"/>
-                <w:bCs w:val="false"/>
-              </w:rPr>
-              <w:t xml:space="preserve">Система должна позволять создавать, просматривать, редактировать и удалять истории (заголовок до 200 символов и текст) с привязкой к региону и/или точке.</w:t>
-            </w:r>
-          </w:p>
-        </w:tc>
-        <w:tc>
-          <w:tcPr>
-            <w:tcW w:type="dxa" w:w="1400"/>
-            <w:tcBorders>
-              <w:top w:val="single" w:color="BFBFBF" w:sz="4"/>
-              <w:left w:val="single" w:color="BFBFBF" w:sz="4"/>
-              <w:bottom w:val="single" w:color="BFBFBF" w:sz="4"/>
-              <w:right w:val="single" w:color="BFBFBF" w:sz="4"/>
-            </w:tcBorders>
-            <w:tcMar>
-              <w:top w:type="dxa" w:w="60"/>
-              <w:left w:type="dxa" w:w="100"/>
-              <w:bottom w:type="dxa" w:w="60"/>
-              <w:right w:type="dxa" w:w="100"/>
-            </w:tcMar>
-          </w:tcPr>
-          <w:p>
-            <w:pPr>
-              <w:jc w:val="center"/>
-            </w:pPr>
-            <w:r>
-              <w:rPr>
-                <w:b w:val="false"/>
-                <w:bCs w:val="false"/>
-              </w:rPr>
-              <w:t xml:space="preserve">Высокий</w:t>
-            </w:r>
-          </w:p>
-        </w:tc>
-      </w:tr>
-      <w:tr>
-        <w:trPr>
-          <w:cantSplit/>
-        </w:trPr>
-        <w:tc>
-          <w:tcPr>
-            <w:tcW w:type="dxa" w:w="1100"/>
-            <w:tcBorders>
-              <w:top w:val="single" w:color="BFBFBF" w:sz="4"/>
-              <w:left w:val="single" w:color="BFBFBF" w:sz="4"/>
-              <w:bottom w:val="single" w:color="BFBFBF" w:sz="4"/>
-              <w:right w:val="single" w:color="BFBFBF" w:sz="4"/>
-            </w:tcBorders>
-            <w:tcMar>
-              <w:top w:type="dxa" w:w="60"/>
-              <w:left w:type="dxa" w:w="100"/>
-              <w:bottom w:type="dxa" w:w="60"/>
-              <w:right w:type="dxa" w:w="100"/>
-            </w:tcMar>
-          </w:tcPr>
-          <w:p>
-            <w:pPr>
-              <w:jc w:val="center"/>
-            </w:pPr>
-            <w:r>
-              <w:rPr>
-                <w:b/>
-                <w:bCs/>
-              </w:rPr>
-              <w:t xml:space="preserve">ФТ-12</w:t>
-            </w:r>
-          </w:p>
-        </w:tc>
-        <w:tc>
-          <w:tcPr>
-            <w:tcW w:type="dxa" w:w="7138"/>
-            <w:tcBorders>
-              <w:top w:val="single" w:color="BFBFBF" w:sz="4"/>
-              <w:left w:val="single" w:color="BFBFBF" w:sz="4"/>
-              <w:bottom w:val="single" w:color="BFBFBF" w:sz="4"/>
-              <w:right w:val="single" w:color="BFBFBF" w:sz="4"/>
-            </w:tcBorders>
-            <w:tcMar>
-              <w:top w:type="dxa" w:w="60"/>
-              <w:left w:type="dxa" w:w="100"/>
-              <w:bottom w:type="dxa" w:w="60"/>
-              <w:right w:type="dxa" w:w="100"/>
-            </w:tcMar>
-          </w:tcPr>
-          <w:p>
-            <w:pPr>
-              <w:jc w:val="left"/>
-            </w:pPr>
-            <w:r>
-              <w:rPr>
-                <w:b w:val="false"/>
-                <w:bCs w:val="false"/>
-              </w:rPr>
-              <w:t xml:space="preserve">Система должна позволять искать истории по словам из заголовка и текста, а также по названию региона.</w:t>
-            </w:r>
-          </w:p>
-        </w:tc>
-        <w:tc>
-          <w:tcPr>
-            <w:tcW w:type="dxa" w:w="1400"/>
-            <w:tcBorders>
-              <w:top w:val="single" w:color="BFBFBF" w:sz="4"/>
-              <w:left w:val="single" w:color="BFBFBF" w:sz="4"/>
-              <w:bottom w:val="single" w:color="BFBFBF" w:sz="4"/>
-              <w:right w:val="single" w:color="BFBFBF" w:sz="4"/>
-            </w:tcBorders>
-            <w:tcMar>
-              <w:top w:type="dxa" w:w="60"/>
-              <w:left w:type="dxa" w:w="100"/>
-              <w:bottom w:type="dxa" w:w="60"/>
-              <w:right w:type="dxa" w:w="100"/>
-            </w:tcMar>
-          </w:tcPr>
-          <w:p>
-            <w:pPr>
-              <w:jc w:val="center"/>
-            </w:pPr>
-            <w:r>
-              <w:rPr>
-                <w:b w:val="false"/>
-                <w:bCs w:val="false"/>
-              </w:rPr>
-              <w:t xml:space="preserve">Средний</w:t>
-            </w:r>
-          </w:p>
-        </w:tc>
-      </w:tr>
-      <w:tr>
-        <w:trPr>
-          <w:cantSplit/>
-        </w:trPr>
-        <w:tc>
-          <w:tcPr>
-            <w:tcW w:type="dxa" w:w="1100"/>
-            <w:tcBorders>
-              <w:top w:val="single" w:color="BFBFBF" w:sz="4"/>
-              <w:left w:val="single" w:color="BFBFBF" w:sz="4"/>
-              <w:bottom w:val="single" w:color="BFBFBF" w:sz="4"/>
-              <w:right w:val="single" w:color="BFBFBF" w:sz="4"/>
-            </w:tcBorders>
-            <w:tcMar>
-              <w:top w:type="dxa" w:w="60"/>
-              <w:left w:type="dxa" w:w="100"/>
-              <w:bottom w:type="dxa" w:w="60"/>
-              <w:right w:type="dxa" w:w="100"/>
-            </w:tcMar>
-          </w:tcPr>
-          <w:p>
-            <w:pPr>
-              <w:jc w:val="center"/>
-            </w:pPr>
-            <w:r>
-              <w:rPr>
-                <w:b/>
-                <w:bCs/>
-              </w:rPr>
-              <w:t xml:space="preserve">ФТ-13</w:t>
-            </w:r>
-          </w:p>
-        </w:tc>
-        <w:tc>
-          <w:tcPr>
-            <w:tcW w:type="dxa" w:w="7138"/>
-            <w:tcBorders>
-              <w:top w:val="single" w:color="BFBFBF" w:sz="4"/>
-              <w:left w:val="single" w:color="BFBFBF" w:sz="4"/>
-              <w:bottom w:val="single" w:color="BFBFBF" w:sz="4"/>
-              <w:right w:val="single" w:color="BFBFBF" w:sz="4"/>
-            </w:tcBorders>
-            <w:tcMar>
-              <w:top w:type="dxa" w:w="60"/>
-              <w:left w:type="dxa" w:w="100"/>
-              <w:bottom w:type="dxa" w:w="60"/>
-              <w:right w:type="dxa" w:w="100"/>
-            </w:tcMar>
-          </w:tcPr>
-          <w:p>
-            <w:pPr>
-              <w:jc w:val="left"/>
-            </w:pPr>
-            <w:r>
-              <w:rPr>
-                <w:b w:val="false"/>
-                <w:bCs w:val="false"/>
-              </w:rPr>
-              <w:t xml:space="preserve">Система должна позволять изменить имя, загрузить и удалить аватар и показывать статистику профиля: число посещённых регионов, историй и фото.</w:t>
-            </w:r>
-          </w:p>
-        </w:tc>
-        <w:tc>
-          <w:tcPr>
-            <w:tcW w:type="dxa" w:w="1400"/>
-            <w:tcBorders>
-              <w:top w:val="single" w:color="BFBFBF" w:sz="4"/>
-              <w:left w:val="single" w:color="BFBFBF" w:sz="4"/>
-              <w:bottom w:val="single" w:color="BFBFBF" w:sz="4"/>
-              <w:right w:val="single" w:color="BFBFBF" w:sz="4"/>
-            </w:tcBorders>
-            <w:tcMar>
-              <w:top w:type="dxa" w:w="60"/>
-              <w:left w:type="dxa" w:w="100"/>
-              <w:bottom w:type="dxa" w:w="60"/>
-              <w:right w:type="dxa" w:w="100"/>
-            </w:tcMar>
-          </w:tcPr>
-          <w:p>
-            <w:pPr>
-              <w:jc w:val="center"/>
-            </w:pPr>
-            <w:r>
-              <w:rPr>
-                <w:b w:val="false"/>
-                <w:bCs w:val="false"/>
-              </w:rPr>
-              <w:t xml:space="preserve">Средний</w:t>
-            </w:r>
-          </w:p>
-        </w:tc>
-      </w:tr>
-      <w:tr>
-        <w:trPr>
-          <w:cantSplit/>
-        </w:trPr>
-        <w:tc>
-          <w:tcPr>
-            <w:tcW w:type="dxa" w:w="1100"/>
-            <w:tcBorders>
-              <w:top w:val="single" w:color="BFBFBF" w:sz="4"/>
-              <w:left w:val="single" w:color="BFBFBF" w:sz="4"/>
-              <w:bottom w:val="single" w:color="BFBFBF" w:sz="4"/>
-              <w:right w:val="single" w:color="BFBFBF" w:sz="4"/>
-            </w:tcBorders>
-            <w:tcMar>
-              <w:top w:type="dxa" w:w="60"/>
-              <w:left w:type="dxa" w:w="100"/>
-              <w:bottom w:type="dxa" w:w="60"/>
-              <w:right w:type="dxa" w:w="100"/>
-            </w:tcMar>
-          </w:tcPr>
-          <w:p>
-            <w:pPr>
-              <w:jc w:val="center"/>
-            </w:pPr>
-            <w:r>
-              <w:rPr>
-                <w:b/>
-                <w:bCs/>
-              </w:rPr>
-              <w:t xml:space="preserve">ФТ-14</w:t>
-            </w:r>
-          </w:p>
-        </w:tc>
-        <w:tc>
-          <w:tcPr>
-            <w:tcW w:type="dxa" w:w="7138"/>
-            <w:tcBorders>
-              <w:top w:val="single" w:color="BFBFBF" w:sz="4"/>
-              <w:left w:val="single" w:color="BFBFBF" w:sz="4"/>
-              <w:bottom w:val="single" w:color="BFBFBF" w:sz="4"/>
-              <w:right w:val="single" w:color="BFBFBF" w:sz="4"/>
-            </w:tcBorders>
-            <w:tcMar>
-              <w:top w:type="dxa" w:w="60"/>
-              <w:left w:type="dxa" w:w="100"/>
-              <w:bottom w:type="dxa" w:w="60"/>
-              <w:right w:type="dxa" w:w="100"/>
-            </w:tcMar>
-          </w:tcPr>
-          <w:p>
-            <w:pPr>
-              <w:jc w:val="left"/>
-            </w:pPr>
-            <w:r>
-              <w:rPr>
-                <w:b w:val="false"/>
-                <w:bCs w:val="false"/>
-              </w:rPr>
-              <w:t xml:space="preserve">Система должна позволять искать пользователей по имени или email, отправлять, принимать и отклонять заявки в друзья, удалять из друзей и просматривать карту, точки, истории и фото друга.</w:t>
-            </w:r>
-          </w:p>
-        </w:tc>
-        <w:tc>
-          <w:tcPr>
-            <w:tcW w:type="dxa" w:w="1400"/>
-            <w:tcBorders>
-              <w:top w:val="single" w:color="BFBFBF" w:sz="4"/>
-              <w:left w:val="single" w:color="BFBFBF" w:sz="4"/>
-              <w:bottom w:val="single" w:color="BFBFBF" w:sz="4"/>
-              <w:right w:val="single" w:color="BFBFBF" w:sz="4"/>
-            </w:tcBorders>
-            <w:tcMar>
-              <w:top w:type="dxa" w:w="60"/>
-              <w:left w:type="dxa" w:w="100"/>
-              <w:bottom w:type="dxa" w:w="60"/>
-              <w:right w:type="dxa" w:w="100"/>
-            </w:tcMar>
-          </w:tcPr>
-          <w:p>
-            <w:pPr>
-              <w:jc w:val="center"/>
-            </w:pPr>
-            <w:r>
-              <w:rPr>
-                <w:b w:val="false"/>
-                <w:bCs w:val="false"/>
-              </w:rPr>
-              <w:t xml:space="preserve">Высокий</w:t>
-            </w:r>
-          </w:p>
-        </w:tc>
-      </w:tr>
-      <w:tr>
-        <w:trPr>
-          <w:cantSplit/>
-        </w:trPr>
-        <w:tc>
-          <w:tcPr>
-            <w:tcW w:type="dxa" w:w="1100"/>
-            <w:tcBorders>
-              <w:top w:val="single" w:color="BFBFBF" w:sz="4"/>
-              <w:left w:val="single" w:color="BFBFBF" w:sz="4"/>
-              <w:bottom w:val="single" w:color="BFBFBF" w:sz="4"/>
-              <w:right w:val="single" w:color="BFBFBF" w:sz="4"/>
-            </w:tcBorders>
-            <w:tcMar>
-              <w:top w:type="dxa" w:w="60"/>
-              <w:left w:type="dxa" w:w="100"/>
-              <w:bottom w:type="dxa" w:w="60"/>
-              <w:right w:type="dxa" w:w="100"/>
-            </w:tcMar>
-          </w:tcPr>
-          <w:p>
-            <w:pPr>
-              <w:jc w:val="center"/>
-            </w:pPr>
-            <w:r>
-              <w:rPr>
-                <w:b/>
-                <w:bCs/>
-              </w:rPr>
-              <w:t xml:space="preserve">ФТ-15</w:t>
             </w:r>
           </w:p>
         </w:tc>
@@ -7274,7 +5723,7 @@
                 <w:b w:val="false"/>
                 <w:bCs w:val="false"/>
               </w:rPr>
-              <w:t xml:space="preserve">Первая загрузка главной страницы должна занимать не более 3 секунд при скорости соединения 10 Мбит/с.</w:t>
+              <w:t xml:space="preserve">Видео должно отдаваться клиенту частями (HTTP Range), без загрузки файла целиком в память сервера.</w:t>
             </w:r>
           </w:p>
         </w:tc>
@@ -7303,6 +5752,98 @@
                 <w:b w:val="false"/>
                 <w:bCs w:val="false"/>
               </w:rPr>
+              <w:t xml:space="preserve">Высокий</w:t>
+            </w:r>
+          </w:p>
+        </w:tc>
+      </w:tr>
+      <w:tr>
+        <w:trPr>
+          <w:cantSplit/>
+        </w:trPr>
+        <w:tc>
+          <w:tcPr>
+            <w:tcW w:type="dxa" w:w="1100"/>
+            <w:tcBorders>
+              <w:top w:val="single" w:color="BFBFBF" w:sz="4"/>
+              <w:left w:val="single" w:color="BFBFBF" w:sz="4"/>
+              <w:bottom w:val="single" w:color="BFBFBF" w:sz="4"/>
+              <w:right w:val="single" w:color="BFBFBF" w:sz="4"/>
+            </w:tcBorders>
+            <w:tcMar>
+              <w:top w:type="dxa" w:w="60"/>
+              <w:left w:type="dxa" w:w="100"/>
+              <w:bottom w:type="dxa" w:w="60"/>
+              <w:right w:type="dxa" w:w="100"/>
+            </w:tcMar>
+          </w:tcPr>
+          <w:p>
+            <w:pPr>
+              <w:jc w:val="center"/>
+            </w:pPr>
+            <w:r>
+              <w:rPr>
+                <w:b/>
+                <w:bCs/>
+              </w:rPr>
+              <w:t xml:space="preserve">НФТ-08</w:t>
+            </w:r>
+          </w:p>
+        </w:tc>
+        <w:tc>
+          <w:tcPr>
+            <w:tcW w:type="dxa" w:w="7138"/>
+            <w:tcBorders>
+              <w:top w:val="single" w:color="BFBFBF" w:sz="4"/>
+              <w:left w:val="single" w:color="BFBFBF" w:sz="4"/>
+              <w:bottom w:val="single" w:color="BFBFBF" w:sz="4"/>
+              <w:right w:val="single" w:color="BFBFBF" w:sz="4"/>
+            </w:tcBorders>
+            <w:tcMar>
+              <w:top w:type="dxa" w:w="60"/>
+              <w:left w:type="dxa" w:w="100"/>
+              <w:bottom w:type="dxa" w:w="60"/>
+              <w:right w:type="dxa" w:w="100"/>
+            </w:tcMar>
+          </w:tcPr>
+          <w:p>
+            <w:pPr>
+              <w:jc w:val="left"/>
+            </w:pPr>
+            <w:r>
+              <w:rPr>
+                <w:b w:val="false"/>
+                <w:bCs w:val="false"/>
+              </w:rPr>
+              <w:t xml:space="preserve">Сервис должен быть доступен не менее 99 % времени в месяц; контейнеры должны автоматически перезапускаться после сбоя, а состояние проверяться по адресу /health.</w:t>
+            </w:r>
+          </w:p>
+        </w:tc>
+        <w:tc>
+          <w:tcPr>
+            <w:tcW w:type="dxa" w:w="1400"/>
+            <w:tcBorders>
+              <w:top w:val="single" w:color="BFBFBF" w:sz="4"/>
+              <w:left w:val="single" w:color="BFBFBF" w:sz="4"/>
+              <w:bottom w:val="single" w:color="BFBFBF" w:sz="4"/>
+              <w:right w:val="single" w:color="BFBFBF" w:sz="4"/>
+            </w:tcBorders>
+            <w:tcMar>
+              <w:top w:type="dxa" w:w="60"/>
+              <w:left w:type="dxa" w:w="100"/>
+              <w:bottom w:type="dxa" w:w="60"/>
+              <w:right w:type="dxa" w:w="100"/>
+            </w:tcMar>
+          </w:tcPr>
+          <w:p>
+            <w:pPr>
+              <w:jc w:val="center"/>
+            </w:pPr>
+            <w:r>
+              <w:rPr>
+                <w:b w:val="false"/>
+                <w:bCs w:val="false"/>
+              </w:rPr>
               <w:t xml:space="preserve">Средний</w:t>
             </w:r>
           </w:p>
@@ -7337,7 +5878,7 @@
                 <w:b/>
                 <w:bCs/>
               </w:rPr>
-              <w:t xml:space="preserve">НФТ-08</w:t>
+              <w:t xml:space="preserve">НФТ-09</w:t>
             </w:r>
           </w:p>
         </w:tc>
@@ -7366,7 +5907,7 @@
                 <w:b w:val="false"/>
                 <w:bCs w:val="false"/>
               </w:rPr>
-              <w:t xml:space="preserve">Видео должно отдаваться клиенту частями (HTTP Range), без загрузки файла целиком в память сервера.</w:t>
+              <w:t xml:space="preserve">Интерфейс должен корректно отображаться и работать на экранах шириной от 360 до 1920 пикселей.</w:t>
             </w:r>
           </w:p>
         </w:tc>
@@ -7429,7 +5970,7 @@
                 <w:b/>
                 <w:bCs/>
               </w:rPr>
-              <w:t xml:space="preserve">НФТ-09</w:t>
+              <w:t xml:space="preserve">НФТ-10</w:t>
             </w:r>
           </w:p>
         </w:tc>
@@ -7458,7 +5999,7 @@
                 <w:b w:val="false"/>
                 <w:bCs w:val="false"/>
               </w:rPr>
-              <w:t xml:space="preserve">При недоступности провайдера геопоиска система должна автоматически переключаться на следующий в порядке Яндекс → Mapbox → Photon → Nominatim.</w:t>
+              <w:t xml:space="preserve">Приложение должно работать в двух последних версиях Chrome, Firefox, Safari, Edge и Яндекс Браузера, а также в мобильных Safari (iOS) и Chrome (Android).</w:t>
             </w:r>
           </w:p>
         </w:tc>
@@ -7487,559 +6028,7 @@
                 <w:b w:val="false"/>
                 <w:bCs w:val="false"/>
               </w:rPr>
-              <w:t xml:space="preserve">Средний</w:t>
-            </w:r>
-          </w:p>
-        </w:tc>
-      </w:tr>
-      <w:tr>
-        <w:trPr>
-          <w:cantSplit/>
-        </w:trPr>
-        <w:tc>
-          <w:tcPr>
-            <w:tcW w:type="dxa" w:w="1100"/>
-            <w:tcBorders>
-              <w:top w:val="single" w:color="BFBFBF" w:sz="4"/>
-              <w:left w:val="single" w:color="BFBFBF" w:sz="4"/>
-              <w:bottom w:val="single" w:color="BFBFBF" w:sz="4"/>
-              <w:right w:val="single" w:color="BFBFBF" w:sz="4"/>
-            </w:tcBorders>
-            <w:tcMar>
-              <w:top w:type="dxa" w:w="60"/>
-              <w:left w:type="dxa" w:w="100"/>
-              <w:bottom w:type="dxa" w:w="60"/>
-              <w:right w:type="dxa" w:w="100"/>
-            </w:tcMar>
-          </w:tcPr>
-          <w:p>
-            <w:pPr>
-              <w:jc w:val="center"/>
-            </w:pPr>
-            <w:r>
-              <w:rPr>
-                <w:b/>
-                <w:bCs/>
-              </w:rPr>
-              <w:t xml:space="preserve">НФТ-10</w:t>
-            </w:r>
-          </w:p>
-        </w:tc>
-        <w:tc>
-          <w:tcPr>
-            <w:tcW w:type="dxa" w:w="7138"/>
-            <w:tcBorders>
-              <w:top w:val="single" w:color="BFBFBF" w:sz="4"/>
-              <w:left w:val="single" w:color="BFBFBF" w:sz="4"/>
-              <w:bottom w:val="single" w:color="BFBFBF" w:sz="4"/>
-              <w:right w:val="single" w:color="BFBFBF" w:sz="4"/>
-            </w:tcBorders>
-            <w:tcMar>
-              <w:top w:type="dxa" w:w="60"/>
-              <w:left w:type="dxa" w:w="100"/>
-              <w:bottom w:type="dxa" w:w="60"/>
-              <w:right w:type="dxa" w:w="100"/>
-            </w:tcMar>
-          </w:tcPr>
-          <w:p>
-            <w:pPr>
-              <w:jc w:val="left"/>
-            </w:pPr>
-            <w:r>
-              <w:rPr>
-                <w:b w:val="false"/>
-                <w:bCs w:val="false"/>
-              </w:rPr>
-              <w:t xml:space="preserve">Сервис должен быть доступен не менее 99 % времени в месяц; контейнеры должны автоматически перезапускаться после сбоя, а состояние проверяться по адресу /health.</w:t>
-            </w:r>
-          </w:p>
-        </w:tc>
-        <w:tc>
-          <w:tcPr>
-            <w:tcW w:type="dxa" w:w="1400"/>
-            <w:tcBorders>
-              <w:top w:val="single" w:color="BFBFBF" w:sz="4"/>
-              <w:left w:val="single" w:color="BFBFBF" w:sz="4"/>
-              <w:bottom w:val="single" w:color="BFBFBF" w:sz="4"/>
-              <w:right w:val="single" w:color="BFBFBF" w:sz="4"/>
-            </w:tcBorders>
-            <w:tcMar>
-              <w:top w:type="dxa" w:w="60"/>
-              <w:left w:type="dxa" w:w="100"/>
-              <w:bottom w:type="dxa" w:w="60"/>
-              <w:right w:type="dxa" w:w="100"/>
-            </w:tcMar>
-          </w:tcPr>
-          <w:p>
-            <w:pPr>
-              <w:jc w:val="center"/>
-            </w:pPr>
-            <w:r>
-              <w:rPr>
-                <w:b w:val="false"/>
-                <w:bCs w:val="false"/>
-              </w:rPr>
-              <w:t xml:space="preserve">Средний</w:t>
-            </w:r>
-          </w:p>
-        </w:tc>
-      </w:tr>
-      <w:tr>
-        <w:trPr>
-          <w:cantSplit/>
-        </w:trPr>
-        <w:tc>
-          <w:tcPr>
-            <w:tcW w:type="dxa" w:w="1100"/>
-            <w:tcBorders>
-              <w:top w:val="single" w:color="BFBFBF" w:sz="4"/>
-              <w:left w:val="single" w:color="BFBFBF" w:sz="4"/>
-              <w:bottom w:val="single" w:color="BFBFBF" w:sz="4"/>
-              <w:right w:val="single" w:color="BFBFBF" w:sz="4"/>
-            </w:tcBorders>
-            <w:tcMar>
-              <w:top w:type="dxa" w:w="60"/>
-              <w:left w:type="dxa" w:w="100"/>
-              <w:bottom w:type="dxa" w:w="60"/>
-              <w:right w:type="dxa" w:w="100"/>
-            </w:tcMar>
-          </w:tcPr>
-          <w:p>
-            <w:pPr>
-              <w:jc w:val="center"/>
-            </w:pPr>
-            <w:r>
-              <w:rPr>
-                <w:b/>
-                <w:bCs/>
-              </w:rPr>
-              <w:t xml:space="preserve">НФТ-11</w:t>
-            </w:r>
-          </w:p>
-        </w:tc>
-        <w:tc>
-          <w:tcPr>
-            <w:tcW w:type="dxa" w:w="7138"/>
-            <w:tcBorders>
-              <w:top w:val="single" w:color="BFBFBF" w:sz="4"/>
-              <w:left w:val="single" w:color="BFBFBF" w:sz="4"/>
-              <w:bottom w:val="single" w:color="BFBFBF" w:sz="4"/>
-              <w:right w:val="single" w:color="BFBFBF" w:sz="4"/>
-            </w:tcBorders>
-            <w:tcMar>
-              <w:top w:type="dxa" w:w="60"/>
-              <w:left w:type="dxa" w:w="100"/>
-              <w:bottom w:type="dxa" w:w="60"/>
-              <w:right w:type="dxa" w:w="100"/>
-            </w:tcMar>
-          </w:tcPr>
-          <w:p>
-            <w:pPr>
-              <w:jc w:val="left"/>
-            </w:pPr>
-            <w:r>
-              <w:rPr>
-                <w:b w:val="false"/>
-                <w:bCs w:val="false"/>
-              </w:rPr>
-              <w:t xml:space="preserve">Данные PostgreSQL и медиафайлы должны храниться в именованных томах Docker и сохраняться при пересборке и перезапуске контейнеров; резервная копия базы данных — не реже 1 раза в сутки.</w:t>
-            </w:r>
-          </w:p>
-        </w:tc>
-        <w:tc>
-          <w:tcPr>
-            <w:tcW w:type="dxa" w:w="1400"/>
-            <w:tcBorders>
-              <w:top w:val="single" w:color="BFBFBF" w:sz="4"/>
-              <w:left w:val="single" w:color="BFBFBF" w:sz="4"/>
-              <w:bottom w:val="single" w:color="BFBFBF" w:sz="4"/>
-              <w:right w:val="single" w:color="BFBFBF" w:sz="4"/>
-            </w:tcBorders>
-            <w:tcMar>
-              <w:top w:type="dxa" w:w="60"/>
-              <w:left w:type="dxa" w:w="100"/>
-              <w:bottom w:type="dxa" w:w="60"/>
-              <w:right w:type="dxa" w:w="100"/>
-            </w:tcMar>
-          </w:tcPr>
-          <w:p>
-            <w:pPr>
-              <w:jc w:val="center"/>
-            </w:pPr>
-            <w:r>
-              <w:rPr>
-                <w:b w:val="false"/>
-                <w:bCs w:val="false"/>
-              </w:rPr>
               <w:t xml:space="preserve">Высокий</w:t>
-            </w:r>
-          </w:p>
-        </w:tc>
-      </w:tr>
-      <w:tr>
-        <w:trPr>
-          <w:cantSplit/>
-        </w:trPr>
-        <w:tc>
-          <w:tcPr>
-            <w:tcW w:type="dxa" w:w="1100"/>
-            <w:tcBorders>
-              <w:top w:val="single" w:color="BFBFBF" w:sz="4"/>
-              <w:left w:val="single" w:color="BFBFBF" w:sz="4"/>
-              <w:bottom w:val="single" w:color="BFBFBF" w:sz="4"/>
-              <w:right w:val="single" w:color="BFBFBF" w:sz="4"/>
-            </w:tcBorders>
-            <w:tcMar>
-              <w:top w:type="dxa" w:w="60"/>
-              <w:left w:type="dxa" w:w="100"/>
-              <w:bottom w:type="dxa" w:w="60"/>
-              <w:right w:type="dxa" w:w="100"/>
-            </w:tcMar>
-          </w:tcPr>
-          <w:p>
-            <w:pPr>
-              <w:jc w:val="center"/>
-            </w:pPr>
-            <w:r>
-              <w:rPr>
-                <w:b/>
-                <w:bCs/>
-              </w:rPr>
-              <w:t xml:space="preserve">НФТ-12</w:t>
-            </w:r>
-          </w:p>
-        </w:tc>
-        <w:tc>
-          <w:tcPr>
-            <w:tcW w:type="dxa" w:w="7138"/>
-            <w:tcBorders>
-              <w:top w:val="single" w:color="BFBFBF" w:sz="4"/>
-              <w:left w:val="single" w:color="BFBFBF" w:sz="4"/>
-              <w:bottom w:val="single" w:color="BFBFBF" w:sz="4"/>
-              <w:right w:val="single" w:color="BFBFBF" w:sz="4"/>
-            </w:tcBorders>
-            <w:tcMar>
-              <w:top w:type="dxa" w:w="60"/>
-              <w:left w:type="dxa" w:w="100"/>
-              <w:bottom w:type="dxa" w:w="60"/>
-              <w:right w:type="dxa" w:w="100"/>
-            </w:tcMar>
-          </w:tcPr>
-          <w:p>
-            <w:pPr>
-              <w:jc w:val="left"/>
-            </w:pPr>
-            <w:r>
-              <w:rPr>
-                <w:b w:val="false"/>
-                <w:bCs w:val="false"/>
-              </w:rPr>
-              <w:t xml:space="preserve">Интерфейс должен корректно отображаться и работать на экранах шириной от 360 до 1920 пикселей.</w:t>
-            </w:r>
-          </w:p>
-        </w:tc>
-        <w:tc>
-          <w:tcPr>
-            <w:tcW w:type="dxa" w:w="1400"/>
-            <w:tcBorders>
-              <w:top w:val="single" w:color="BFBFBF" w:sz="4"/>
-              <w:left w:val="single" w:color="BFBFBF" w:sz="4"/>
-              <w:bottom w:val="single" w:color="BFBFBF" w:sz="4"/>
-              <w:right w:val="single" w:color="BFBFBF" w:sz="4"/>
-            </w:tcBorders>
-            <w:tcMar>
-              <w:top w:type="dxa" w:w="60"/>
-              <w:left w:type="dxa" w:w="100"/>
-              <w:bottom w:type="dxa" w:w="60"/>
-              <w:right w:type="dxa" w:w="100"/>
-            </w:tcMar>
-          </w:tcPr>
-          <w:p>
-            <w:pPr>
-              <w:jc w:val="center"/>
-            </w:pPr>
-            <w:r>
-              <w:rPr>
-                <w:b w:val="false"/>
-                <w:bCs w:val="false"/>
-              </w:rPr>
-              <w:t xml:space="preserve">Высокий</w:t>
-            </w:r>
-          </w:p>
-        </w:tc>
-      </w:tr>
-      <w:tr>
-        <w:trPr>
-          <w:cantSplit/>
-        </w:trPr>
-        <w:tc>
-          <w:tcPr>
-            <w:tcW w:type="dxa" w:w="1100"/>
-            <w:tcBorders>
-              <w:top w:val="single" w:color="BFBFBF" w:sz="4"/>
-              <w:left w:val="single" w:color="BFBFBF" w:sz="4"/>
-              <w:bottom w:val="single" w:color="BFBFBF" w:sz="4"/>
-              <w:right w:val="single" w:color="BFBFBF" w:sz="4"/>
-            </w:tcBorders>
-            <w:tcMar>
-              <w:top w:type="dxa" w:w="60"/>
-              <w:left w:type="dxa" w:w="100"/>
-              <w:bottom w:type="dxa" w:w="60"/>
-              <w:right w:type="dxa" w:w="100"/>
-            </w:tcMar>
-          </w:tcPr>
-          <w:p>
-            <w:pPr>
-              <w:jc w:val="center"/>
-            </w:pPr>
-            <w:r>
-              <w:rPr>
-                <w:b/>
-                <w:bCs/>
-              </w:rPr>
-              <w:t xml:space="preserve">НФТ-13</w:t>
-            </w:r>
-          </w:p>
-        </w:tc>
-        <w:tc>
-          <w:tcPr>
-            <w:tcW w:type="dxa" w:w="7138"/>
-            <w:tcBorders>
-              <w:top w:val="single" w:color="BFBFBF" w:sz="4"/>
-              <w:left w:val="single" w:color="BFBFBF" w:sz="4"/>
-              <w:bottom w:val="single" w:color="BFBFBF" w:sz="4"/>
-              <w:right w:val="single" w:color="BFBFBF" w:sz="4"/>
-            </w:tcBorders>
-            <w:tcMar>
-              <w:top w:type="dxa" w:w="60"/>
-              <w:left w:type="dxa" w:w="100"/>
-              <w:bottom w:type="dxa" w:w="60"/>
-              <w:right w:type="dxa" w:w="100"/>
-            </w:tcMar>
-          </w:tcPr>
-          <w:p>
-            <w:pPr>
-              <w:jc w:val="left"/>
-            </w:pPr>
-            <w:r>
-              <w:rPr>
-                <w:b w:val="false"/>
-                <w:bCs w:val="false"/>
-              </w:rPr>
-              <w:t xml:space="preserve">Приложение должно работать в двух последних версиях Chrome, Firefox, Safari, Edge и Яндекс Браузера, а также в мобильных Safari (iOS) и Chrome (Android).</w:t>
-            </w:r>
-          </w:p>
-        </w:tc>
-        <w:tc>
-          <w:tcPr>
-            <w:tcW w:type="dxa" w:w="1400"/>
-            <w:tcBorders>
-              <w:top w:val="single" w:color="BFBFBF" w:sz="4"/>
-              <w:left w:val="single" w:color="BFBFBF" w:sz="4"/>
-              <w:bottom w:val="single" w:color="BFBFBF" w:sz="4"/>
-              <w:right w:val="single" w:color="BFBFBF" w:sz="4"/>
-            </w:tcBorders>
-            <w:tcMar>
-              <w:top w:type="dxa" w:w="60"/>
-              <w:left w:type="dxa" w:w="100"/>
-              <w:bottom w:type="dxa" w:w="60"/>
-              <w:right w:type="dxa" w:w="100"/>
-            </w:tcMar>
-          </w:tcPr>
-          <w:p>
-            <w:pPr>
-              <w:jc w:val="center"/>
-            </w:pPr>
-            <w:r>
-              <w:rPr>
-                <w:b w:val="false"/>
-                <w:bCs w:val="false"/>
-              </w:rPr>
-              <w:t xml:space="preserve">Высокий</w:t>
-            </w:r>
-          </w:p>
-        </w:tc>
-      </w:tr>
-      <w:tr>
-        <w:trPr>
-          <w:cantSplit/>
-        </w:trPr>
-        <w:tc>
-          <w:tcPr>
-            <w:tcW w:type="dxa" w:w="1100"/>
-            <w:tcBorders>
-              <w:top w:val="single" w:color="BFBFBF" w:sz="4"/>
-              <w:left w:val="single" w:color="BFBFBF" w:sz="4"/>
-              <w:bottom w:val="single" w:color="BFBFBF" w:sz="4"/>
-              <w:right w:val="single" w:color="BFBFBF" w:sz="4"/>
-            </w:tcBorders>
-            <w:tcMar>
-              <w:top w:type="dxa" w:w="60"/>
-              <w:left w:type="dxa" w:w="100"/>
-              <w:bottom w:type="dxa" w:w="60"/>
-              <w:right w:type="dxa" w:w="100"/>
-            </w:tcMar>
-          </w:tcPr>
-          <w:p>
-            <w:pPr>
-              <w:jc w:val="center"/>
-            </w:pPr>
-            <w:r>
-              <w:rPr>
-                <w:b/>
-                <w:bCs/>
-              </w:rPr>
-              <w:t xml:space="preserve">НФТ-14</w:t>
-            </w:r>
-          </w:p>
-        </w:tc>
-        <w:tc>
-          <w:tcPr>
-            <w:tcW w:type="dxa" w:w="7138"/>
-            <w:tcBorders>
-              <w:top w:val="single" w:color="BFBFBF" w:sz="4"/>
-              <w:left w:val="single" w:color="BFBFBF" w:sz="4"/>
-              <w:bottom w:val="single" w:color="BFBFBF" w:sz="4"/>
-              <w:right w:val="single" w:color="BFBFBF" w:sz="4"/>
-            </w:tcBorders>
-            <w:tcMar>
-              <w:top w:type="dxa" w:w="60"/>
-              <w:left w:type="dxa" w:w="100"/>
-              <w:bottom w:type="dxa" w:w="60"/>
-              <w:right w:type="dxa" w:w="100"/>
-            </w:tcMar>
-          </w:tcPr>
-          <w:p>
-            <w:pPr>
-              <w:jc w:val="left"/>
-            </w:pPr>
-            <w:r>
-              <w:rPr>
-                <w:b w:val="false"/>
-                <w:bCs w:val="false"/>
-              </w:rPr>
-              <w:t xml:space="preserve">Сервер не должен хранить состояние сессии (stateless, JWT), чтобы можно было запустить несколько экземпляров за балансировщиком нагрузки.</w:t>
-            </w:r>
-          </w:p>
-        </w:tc>
-        <w:tc>
-          <w:tcPr>
-            <w:tcW w:type="dxa" w:w="1400"/>
-            <w:tcBorders>
-              <w:top w:val="single" w:color="BFBFBF" w:sz="4"/>
-              <w:left w:val="single" w:color="BFBFBF" w:sz="4"/>
-              <w:bottom w:val="single" w:color="BFBFBF" w:sz="4"/>
-              <w:right w:val="single" w:color="BFBFBF" w:sz="4"/>
-            </w:tcBorders>
-            <w:tcMar>
-              <w:top w:type="dxa" w:w="60"/>
-              <w:left w:type="dxa" w:w="100"/>
-              <w:bottom w:type="dxa" w:w="60"/>
-              <w:right w:type="dxa" w:w="100"/>
-            </w:tcMar>
-          </w:tcPr>
-          <w:p>
-            <w:pPr>
-              <w:jc w:val="center"/>
-            </w:pPr>
-            <w:r>
-              <w:rPr>
-                <w:b w:val="false"/>
-                <w:bCs w:val="false"/>
-              </w:rPr>
-              <w:t xml:space="preserve">Низкий</w:t>
-            </w:r>
-          </w:p>
-        </w:tc>
-      </w:tr>
-      <w:tr>
-        <w:trPr>
-          <w:cantSplit/>
-        </w:trPr>
-        <w:tc>
-          <w:tcPr>
-            <w:tcW w:type="dxa" w:w="1100"/>
-            <w:tcBorders>
-              <w:top w:val="single" w:color="BFBFBF" w:sz="4"/>
-              <w:left w:val="single" w:color="BFBFBF" w:sz="4"/>
-              <w:bottom w:val="single" w:color="BFBFBF" w:sz="4"/>
-              <w:right w:val="single" w:color="BFBFBF" w:sz="4"/>
-            </w:tcBorders>
-            <w:tcMar>
-              <w:top w:type="dxa" w:w="60"/>
-              <w:left w:type="dxa" w:w="100"/>
-              <w:bottom w:type="dxa" w:w="60"/>
-              <w:right w:type="dxa" w:w="100"/>
-            </w:tcMar>
-          </w:tcPr>
-          <w:p>
-            <w:pPr>
-              <w:jc w:val="center"/>
-            </w:pPr>
-            <w:r>
-              <w:rPr>
-                <w:b/>
-                <w:bCs/>
-              </w:rPr>
-              <w:t xml:space="preserve">НФТ-15</w:t>
-            </w:r>
-          </w:p>
-        </w:tc>
-        <w:tc>
-          <w:tcPr>
-            <w:tcW w:type="dxa" w:w="7138"/>
-            <w:tcBorders>
-              <w:top w:val="single" w:color="BFBFBF" w:sz="4"/>
-              <w:left w:val="single" w:color="BFBFBF" w:sz="4"/>
-              <w:bottom w:val="single" w:color="BFBFBF" w:sz="4"/>
-              <w:right w:val="single" w:color="BFBFBF" w:sz="4"/>
-            </w:tcBorders>
-            <w:tcMar>
-              <w:top w:type="dxa" w:w="60"/>
-              <w:left w:type="dxa" w:w="100"/>
-              <w:bottom w:type="dxa" w:w="60"/>
-              <w:right w:type="dxa" w:w="100"/>
-            </w:tcMar>
-          </w:tcPr>
-          <w:p>
-            <w:pPr>
-              <w:jc w:val="left"/>
-            </w:pPr>
-            <w:r>
-              <w:rPr>
-                <w:b w:val="false"/>
-                <w:bCs w:val="false"/>
-              </w:rPr>
-              <w:t xml:space="preserve">API должно быть описано в формате OpenAPI и доступно в Swagger UI; ошибки должны возвращаться в едином JSON-формате с понятным текстом на русском языке.</w:t>
-            </w:r>
-          </w:p>
-        </w:tc>
-        <w:tc>
-          <w:tcPr>
-            <w:tcW w:type="dxa" w:w="1400"/>
-            <w:tcBorders>
-              <w:top w:val="single" w:color="BFBFBF" w:sz="4"/>
-              <w:left w:val="single" w:color="BFBFBF" w:sz="4"/>
-              <w:bottom w:val="single" w:color="BFBFBF" w:sz="4"/>
-              <w:right w:val="single" w:color="BFBFBF" w:sz="4"/>
-            </w:tcBorders>
-            <w:tcMar>
-              <w:top w:type="dxa" w:w="60"/>
-              <w:left w:type="dxa" w:w="100"/>
-              <w:bottom w:type="dxa" w:w="60"/>
-              <w:right w:type="dxa" w:w="100"/>
-            </w:tcMar>
-          </w:tcPr>
-          <w:p>
-            <w:pPr>
-              <w:jc w:val="center"/>
-            </w:pPr>
-            <w:r>
-              <w:rPr>
-                <w:b w:val="false"/>
-                <w:bCs w:val="false"/>
-              </w:rPr>
-              <w:t xml:space="preserve">Средний</w:t>
             </w:r>
           </w:p>
         </w:tc>
@@ -8425,7 +6414,7 @@
                 <w:b w:val="false"/>
                 <w:bCs w:val="false"/>
               </w:rPr>
-              <w:t xml:space="preserve">Эстетика интерфейса</w:t>
+              <w:t xml:space="preserve">Доступность (accessibility)</w:t>
             </w:r>
           </w:p>
         </w:tc>
@@ -8454,7 +6443,7 @@
                 <w:b w:val="false"/>
                 <w:bCs w:val="false"/>
               </w:rPr>
-              <w:t xml:space="preserve">Единый визуальный стиль на всех страницах; анимации открытия карточек и окон плавные, без заметных подтормаживаний.</w:t>
+              <w:t xml:space="preserve">У всех кнопок-иконок есть текстовые подписи (aria-label); контраст основного текста — не ниже 4,5:1 (WCAG 2.1 уровень AA).</w:t>
             </w:r>
           </w:p>
         </w:tc>
@@ -8517,7 +6506,7 @@
                 <w:b w:val="false"/>
                 <w:bCs w:val="false"/>
               </w:rPr>
-              <w:t xml:space="preserve">Доступность (accessibility)</w:t>
+              <w:t xml:space="preserve">Конфиденциальность</w:t>
             </w:r>
           </w:p>
         </w:tc>
@@ -8546,7 +6535,7 @@
                 <w:b w:val="false"/>
                 <w:bCs w:val="false"/>
               </w:rPr>
-              <w:t xml:space="preserve">У всех кнопок-иконок есть текстовые подписи (aria-label); контраст основного текста — не ниже 4,5:1 (WCAG 2.1 уровень AA).</w:t>
+              <w:t xml:space="preserve">100 % запросов к контенту пользователя от человека, не являющегося его другом, получают отказ (код 403).</w:t>
             </w:r>
           </w:p>
         </w:tc>
@@ -8609,7 +6598,7 @@
                 <w:b w:val="false"/>
                 <w:bCs w:val="false"/>
               </w:rPr>
-              <w:t xml:space="preserve">Конфиденциальность</w:t>
+              <w:t xml:space="preserve">Целостность данных</w:t>
             </w:r>
           </w:p>
         </w:tc>
@@ -8638,7 +6627,7 @@
                 <w:b w:val="false"/>
                 <w:bCs w:val="false"/>
               </w:rPr>
-              <w:t xml:space="preserve">100 % запросов к контенту пользователя от человека, не являющегося его другом, получают отказ (код 403).</w:t>
+              <w:t xml:space="preserve">Ограничения базы данных (уникальность, внешние ключи, CHECK) не допускают двойных отметок региона и дружбы с самим собой даже при одновременных запросах.</w:t>
             </w:r>
           </w:p>
         </w:tc>
@@ -8701,7 +6690,7 @@
                 <w:b w:val="false"/>
                 <w:bCs w:val="false"/>
               </w:rPr>
-              <w:t xml:space="preserve">Целостность данных</w:t>
+              <w:t xml:space="preserve">Отказоустойчивость</w:t>
             </w:r>
           </w:p>
         </w:tc>
@@ -8730,7 +6719,7 @@
                 <w:b w:val="false"/>
                 <w:bCs w:val="false"/>
               </w:rPr>
-              <w:t xml:space="preserve">Ограничения базы данных (уникальность, внешние ключи, CHECK) не допускают двойных отметок региона и дружбы с самим собой даже при одновременных запросах.</w:t>
+              <w:t xml:space="preserve">Сбой отправки письма или внешнего геосервиса не приводит к падению приложения: ошибка записывается в лог, пользователь получает понятный ответ.</w:t>
             </w:r>
           </w:p>
         </w:tc>
@@ -8793,7 +6782,7 @@
                 <w:b w:val="false"/>
                 <w:bCs w:val="false"/>
               </w:rPr>
-              <w:t xml:space="preserve">Отказоустойчивость</w:t>
+              <w:t xml:space="preserve">Модульность</w:t>
             </w:r>
           </w:p>
         </w:tc>
@@ -8822,7 +6811,7 @@
                 <w:b w:val="false"/>
                 <w:bCs w:val="false"/>
               </w:rPr>
-              <w:t xml:space="preserve">Сбой отправки письма или внешнего геосервиса не приводит к падению приложения: ошибка записывается в лог, пользователь получает понятный ответ.</w:t>
+              <w:t xml:space="preserve">Серверный код разделён на независимые доменные модули (auth, visit, place, story, photo, friend, notify, geo); изменение одного модуля не требует правок в других.</w:t>
             </w:r>
           </w:p>
         </w:tc>
@@ -8885,7 +6874,7 @@
                 <w:b w:val="false"/>
                 <w:bCs w:val="false"/>
               </w:rPr>
-              <w:t xml:space="preserve">Восстанавливаемость</w:t>
+              <w:t xml:space="preserve">Модифицируемость</w:t>
             </w:r>
           </w:p>
         </w:tc>
@@ -8914,7 +6903,7 @@
                 <w:b w:val="false"/>
                 <w:bCs w:val="false"/>
               </w:rPr>
-              <w:t xml:space="preserve">После перезапуска сервера работа сервиса восстанавливается не более чем за 2 минуты без потери данных.</w:t>
+              <w:t xml:space="preserve">Каждое изменение структуры базы данных оформляется отдельной версионной миграцией Flyway, поэтому схема одинаково воспроизводится на любом окружении.</w:t>
             </w:r>
           </w:p>
         </w:tc>
@@ -8977,7 +6966,7 @@
                 <w:b w:val="false"/>
                 <w:bCs w:val="false"/>
               </w:rPr>
-              <w:t xml:space="preserve">Модульность</w:t>
+              <w:t xml:space="preserve">Переносимость</w:t>
             </w:r>
           </w:p>
         </w:tc>
@@ -9006,7 +6995,7 @@
                 <w:b w:val="false"/>
                 <w:bCs w:val="false"/>
               </w:rPr>
-              <w:t xml:space="preserve">Серверный код разделён на независимые доменные модули (auth, visit, place, story, photo, friend, notify, geo); изменение одного модуля не требует правок в других.</w:t>
+              <w:t xml:space="preserve">Развёртывание на новом сервере выполняется одной командой docker compose и занимает не более 15 минут.</w:t>
             </w:r>
           </w:p>
         </w:tc>
@@ -9069,7 +7058,7 @@
                 <w:b w:val="false"/>
                 <w:bCs w:val="false"/>
               </w:rPr>
-              <w:t xml:space="preserve">Модифицируемость</w:t>
+              <w:t xml:space="preserve">Отзывчивость интерфейса</w:t>
             </w:r>
           </w:p>
         </w:tc>
@@ -9098,467 +7087,7 @@
                 <w:b w:val="false"/>
                 <w:bCs w:val="false"/>
               </w:rPr>
-              <w:t xml:space="preserve">Каждое изменение структуры базы данных оформляется отдельной версионной миграцией Flyway, поэтому схема одинаково воспроизводится на любом окружении.</w:t>
-            </w:r>
-          </w:p>
-        </w:tc>
-      </w:tr>
-      <w:tr>
-        <w:trPr>
-          <w:cantSplit/>
-        </w:trPr>
-        <w:tc>
-          <w:tcPr>
-            <w:tcW w:type="dxa" w:w="1100"/>
-            <w:tcBorders>
-              <w:top w:val="single" w:color="BFBFBF" w:sz="4"/>
-              <w:left w:val="single" w:color="BFBFBF" w:sz="4"/>
-              <w:bottom w:val="single" w:color="BFBFBF" w:sz="4"/>
-              <w:right w:val="single" w:color="BFBFBF" w:sz="4"/>
-            </w:tcBorders>
-            <w:tcMar>
-              <w:top w:type="dxa" w:w="60"/>
-              <w:left w:type="dxa" w:w="100"/>
-              <w:bottom w:type="dxa" w:w="60"/>
-              <w:right w:type="dxa" w:w="100"/>
-            </w:tcMar>
-          </w:tcPr>
-          <w:p>
-            <w:pPr>
-              <w:jc w:val="center"/>
-            </w:pPr>
-            <w:r>
-              <w:rPr>
-                <w:b/>
-                <w:bCs/>
-              </w:rPr>
-              <w:t xml:space="preserve">АК-11</w:t>
-            </w:r>
-          </w:p>
-        </w:tc>
-        <w:tc>
-          <w:tcPr>
-            <w:tcW w:type="dxa" w:w="2700"/>
-            <w:tcBorders>
-              <w:top w:val="single" w:color="BFBFBF" w:sz="4"/>
-              <w:left w:val="single" w:color="BFBFBF" w:sz="4"/>
-              <w:bottom w:val="single" w:color="BFBFBF" w:sz="4"/>
-              <w:right w:val="single" w:color="BFBFBF" w:sz="4"/>
-            </w:tcBorders>
-            <w:tcMar>
-              <w:top w:type="dxa" w:w="60"/>
-              <w:left w:type="dxa" w:w="100"/>
-              <w:bottom w:type="dxa" w:w="60"/>
-              <w:right w:type="dxa" w:w="100"/>
-            </w:tcMar>
-          </w:tcPr>
-          <w:p>
-            <w:pPr>
-              <w:jc w:val="left"/>
-            </w:pPr>
-            <w:r>
-              <w:rPr>
-                <w:b w:val="false"/>
-                <w:bCs w:val="false"/>
-              </w:rPr>
-              <w:t xml:space="preserve">Переносимость</w:t>
-            </w:r>
-          </w:p>
-        </w:tc>
-        <w:tc>
-          <w:tcPr>
-            <w:tcW w:type="dxa" w:w="5838"/>
-            <w:tcBorders>
-              <w:top w:val="single" w:color="BFBFBF" w:sz="4"/>
-              <w:left w:val="single" w:color="BFBFBF" w:sz="4"/>
-              <w:bottom w:val="single" w:color="BFBFBF" w:sz="4"/>
-              <w:right w:val="single" w:color="BFBFBF" w:sz="4"/>
-            </w:tcBorders>
-            <w:tcMar>
-              <w:top w:type="dxa" w:w="60"/>
-              <w:left w:type="dxa" w:w="100"/>
-              <w:bottom w:type="dxa" w:w="60"/>
-              <w:right w:type="dxa" w:w="100"/>
-            </w:tcMar>
-          </w:tcPr>
-          <w:p>
-            <w:pPr>
-              <w:jc w:val="left"/>
-            </w:pPr>
-            <w:r>
-              <w:rPr>
-                <w:b w:val="false"/>
-                <w:bCs w:val="false"/>
-              </w:rPr>
-              <w:t xml:space="preserve">Развёртывание на новом сервере выполняется одной командой docker compose и занимает не более 15 минут.</w:t>
-            </w:r>
-          </w:p>
-        </w:tc>
-      </w:tr>
-      <w:tr>
-        <w:trPr>
-          <w:cantSplit/>
-        </w:trPr>
-        <w:tc>
-          <w:tcPr>
-            <w:tcW w:type="dxa" w:w="1100"/>
-            <w:tcBorders>
-              <w:top w:val="single" w:color="BFBFBF" w:sz="4"/>
-              <w:left w:val="single" w:color="BFBFBF" w:sz="4"/>
-              <w:bottom w:val="single" w:color="BFBFBF" w:sz="4"/>
-              <w:right w:val="single" w:color="BFBFBF" w:sz="4"/>
-            </w:tcBorders>
-            <w:tcMar>
-              <w:top w:type="dxa" w:w="60"/>
-              <w:left w:type="dxa" w:w="100"/>
-              <w:bottom w:type="dxa" w:w="60"/>
-              <w:right w:type="dxa" w:w="100"/>
-            </w:tcMar>
-          </w:tcPr>
-          <w:p>
-            <w:pPr>
-              <w:jc w:val="center"/>
-            </w:pPr>
-            <w:r>
-              <w:rPr>
-                <w:b/>
-                <w:bCs/>
-              </w:rPr>
-              <w:t xml:space="preserve">АК-12</w:t>
-            </w:r>
-          </w:p>
-        </w:tc>
-        <w:tc>
-          <w:tcPr>
-            <w:tcW w:type="dxa" w:w="2700"/>
-            <w:tcBorders>
-              <w:top w:val="single" w:color="BFBFBF" w:sz="4"/>
-              <w:left w:val="single" w:color="BFBFBF" w:sz="4"/>
-              <w:bottom w:val="single" w:color="BFBFBF" w:sz="4"/>
-              <w:right w:val="single" w:color="BFBFBF" w:sz="4"/>
-            </w:tcBorders>
-            <w:tcMar>
-              <w:top w:type="dxa" w:w="60"/>
-              <w:left w:type="dxa" w:w="100"/>
-              <w:bottom w:type="dxa" w:w="60"/>
-              <w:right w:type="dxa" w:w="100"/>
-            </w:tcMar>
-          </w:tcPr>
-          <w:p>
-            <w:pPr>
-              <w:jc w:val="left"/>
-            </w:pPr>
-            <w:r>
-              <w:rPr>
-                <w:b w:val="false"/>
-                <w:bCs w:val="false"/>
-              </w:rPr>
-              <w:t xml:space="preserve">Конфигурируемость</w:t>
-            </w:r>
-          </w:p>
-        </w:tc>
-        <w:tc>
-          <w:tcPr>
-            <w:tcW w:type="dxa" w:w="5838"/>
-            <w:tcBorders>
-              <w:top w:val="single" w:color="BFBFBF" w:sz="4"/>
-              <w:left w:val="single" w:color="BFBFBF" w:sz="4"/>
-              <w:bottom w:val="single" w:color="BFBFBF" w:sz="4"/>
-              <w:right w:val="single" w:color="BFBFBF" w:sz="4"/>
-            </w:tcBorders>
-            <w:tcMar>
-              <w:top w:type="dxa" w:w="60"/>
-              <w:left w:type="dxa" w:w="100"/>
-              <w:bottom w:type="dxa" w:w="60"/>
-              <w:right w:type="dxa" w:w="100"/>
-            </w:tcMar>
-          </w:tcPr>
-          <w:p>
-            <w:pPr>
-              <w:jc w:val="left"/>
-            </w:pPr>
-            <w:r>
-              <w:rPr>
-                <w:b w:val="false"/>
-                <w:bCs w:val="false"/>
-              </w:rPr>
-              <w:t xml:space="preserve">Все секреты, ключи API и адреса задаются переменными окружения; для смены окружения изменение кода не требуется.</w:t>
-            </w:r>
-          </w:p>
-        </w:tc>
-      </w:tr>
-      <w:tr>
-        <w:trPr>
-          <w:cantSplit/>
-        </w:trPr>
-        <w:tc>
-          <w:tcPr>
-            <w:tcW w:type="dxa" w:w="1100"/>
-            <w:tcBorders>
-              <w:top w:val="single" w:color="BFBFBF" w:sz="4"/>
-              <w:left w:val="single" w:color="BFBFBF" w:sz="4"/>
-              <w:bottom w:val="single" w:color="BFBFBF" w:sz="4"/>
-              <w:right w:val="single" w:color="BFBFBF" w:sz="4"/>
-            </w:tcBorders>
-            <w:tcMar>
-              <w:top w:type="dxa" w:w="60"/>
-              <w:left w:type="dxa" w:w="100"/>
-              <w:bottom w:type="dxa" w:w="60"/>
-              <w:right w:type="dxa" w:w="100"/>
-            </w:tcMar>
-          </w:tcPr>
-          <w:p>
-            <w:pPr>
-              <w:jc w:val="center"/>
-            </w:pPr>
-            <w:r>
-              <w:rPr>
-                <w:b/>
-                <w:bCs/>
-              </w:rPr>
-              <w:t xml:space="preserve">АК-13</w:t>
-            </w:r>
-          </w:p>
-        </w:tc>
-        <w:tc>
-          <w:tcPr>
-            <w:tcW w:type="dxa" w:w="2700"/>
-            <w:tcBorders>
-              <w:top w:val="single" w:color="BFBFBF" w:sz="4"/>
-              <w:left w:val="single" w:color="BFBFBF" w:sz="4"/>
-              <w:bottom w:val="single" w:color="BFBFBF" w:sz="4"/>
-              <w:right w:val="single" w:color="BFBFBF" w:sz="4"/>
-            </w:tcBorders>
-            <w:tcMar>
-              <w:top w:type="dxa" w:w="60"/>
-              <w:left w:type="dxa" w:w="100"/>
-              <w:bottom w:type="dxa" w:w="60"/>
-              <w:right w:type="dxa" w:w="100"/>
-            </w:tcMar>
-          </w:tcPr>
-          <w:p>
-            <w:pPr>
-              <w:jc w:val="left"/>
-            </w:pPr>
-            <w:r>
-              <w:rPr>
-                <w:b w:val="false"/>
-                <w:bCs w:val="false"/>
-              </w:rPr>
-              <w:t xml:space="preserve">Тестируемость</w:t>
-            </w:r>
-          </w:p>
-        </w:tc>
-        <w:tc>
-          <w:tcPr>
-            <w:tcW w:type="dxa" w:w="5838"/>
-            <w:tcBorders>
-              <w:top w:val="single" w:color="BFBFBF" w:sz="4"/>
-              <w:left w:val="single" w:color="BFBFBF" w:sz="4"/>
-              <w:bottom w:val="single" w:color="BFBFBF" w:sz="4"/>
-              <w:right w:val="single" w:color="BFBFBF" w:sz="4"/>
-            </w:tcBorders>
-            <w:tcMar>
-              <w:top w:type="dxa" w:w="60"/>
-              <w:left w:type="dxa" w:w="100"/>
-              <w:bottom w:type="dxa" w:w="60"/>
-              <w:right w:type="dxa" w:w="100"/>
-            </w:tcMar>
-          </w:tcPr>
-          <w:p>
-            <w:pPr>
-              <w:jc w:val="left"/>
-            </w:pPr>
-            <w:r>
-              <w:rPr>
-                <w:b w:val="false"/>
-                <w:bCs w:val="false"/>
-              </w:rPr>
-              <w:t xml:space="preserve">Любой метод API можно проверить через Swagger UI без клиентского приложения; письма в локальном окружении перехватываются MailHog.</w:t>
-            </w:r>
-          </w:p>
-        </w:tc>
-      </w:tr>
-      <w:tr>
-        <w:trPr>
-          <w:cantSplit/>
-        </w:trPr>
-        <w:tc>
-          <w:tcPr>
-            <w:tcW w:type="dxa" w:w="1100"/>
-            <w:tcBorders>
-              <w:top w:val="single" w:color="BFBFBF" w:sz="4"/>
-              <w:left w:val="single" w:color="BFBFBF" w:sz="4"/>
-              <w:bottom w:val="single" w:color="BFBFBF" w:sz="4"/>
-              <w:right w:val="single" w:color="BFBFBF" w:sz="4"/>
-            </w:tcBorders>
-            <w:tcMar>
-              <w:top w:type="dxa" w:w="60"/>
-              <w:left w:type="dxa" w:w="100"/>
-              <w:bottom w:type="dxa" w:w="60"/>
-              <w:right w:type="dxa" w:w="100"/>
-            </w:tcMar>
-          </w:tcPr>
-          <w:p>
-            <w:pPr>
-              <w:jc w:val="center"/>
-            </w:pPr>
-            <w:r>
-              <w:rPr>
-                <w:b/>
-                <w:bCs/>
-              </w:rPr>
-              <w:t xml:space="preserve">АК-14</w:t>
-            </w:r>
-          </w:p>
-        </w:tc>
-        <w:tc>
-          <w:tcPr>
-            <w:tcW w:type="dxa" w:w="2700"/>
-            <w:tcBorders>
-              <w:top w:val="single" w:color="BFBFBF" w:sz="4"/>
-              <w:left w:val="single" w:color="BFBFBF" w:sz="4"/>
-              <w:bottom w:val="single" w:color="BFBFBF" w:sz="4"/>
-              <w:right w:val="single" w:color="BFBFBF" w:sz="4"/>
-            </w:tcBorders>
-            <w:tcMar>
-              <w:top w:type="dxa" w:w="60"/>
-              <w:left w:type="dxa" w:w="100"/>
-              <w:bottom w:type="dxa" w:w="60"/>
-              <w:right w:type="dxa" w:w="100"/>
-            </w:tcMar>
-          </w:tcPr>
-          <w:p>
-            <w:pPr>
-              <w:jc w:val="left"/>
-            </w:pPr>
-            <w:r>
-              <w:rPr>
-                <w:b w:val="false"/>
-                <w:bCs w:val="false"/>
-              </w:rPr>
-              <w:t xml:space="preserve">Отзывчивость интерфейса</w:t>
-            </w:r>
-          </w:p>
-        </w:tc>
-        <w:tc>
-          <w:tcPr>
-            <w:tcW w:type="dxa" w:w="5838"/>
-            <w:tcBorders>
-              <w:top w:val="single" w:color="BFBFBF" w:sz="4"/>
-              <w:left w:val="single" w:color="BFBFBF" w:sz="4"/>
-              <w:bottom w:val="single" w:color="BFBFBF" w:sz="4"/>
-              <w:right w:val="single" w:color="BFBFBF" w:sz="4"/>
-            </w:tcBorders>
-            <w:tcMar>
-              <w:top w:type="dxa" w:w="60"/>
-              <w:left w:type="dxa" w:w="100"/>
-              <w:bottom w:type="dxa" w:w="60"/>
-              <w:right w:type="dxa" w:w="100"/>
-            </w:tcMar>
-          </w:tcPr>
-          <w:p>
-            <w:pPr>
-              <w:jc w:val="left"/>
-            </w:pPr>
-            <w:r>
-              <w:rPr>
-                <w:b w:val="false"/>
-                <w:bCs w:val="false"/>
-              </w:rPr>
               <w:t xml:space="preserve">Во время загрузки файлов и публикации показывается индикатор процесса; интерфейс не блокируется и не «зависает».</w:t>
-            </w:r>
-          </w:p>
-        </w:tc>
-      </w:tr>
-      <w:tr>
-        <w:trPr>
-          <w:cantSplit/>
-        </w:trPr>
-        <w:tc>
-          <w:tcPr>
-            <w:tcW w:type="dxa" w:w="1100"/>
-            <w:tcBorders>
-              <w:top w:val="single" w:color="BFBFBF" w:sz="4"/>
-              <w:left w:val="single" w:color="BFBFBF" w:sz="4"/>
-              <w:bottom w:val="single" w:color="BFBFBF" w:sz="4"/>
-              <w:right w:val="single" w:color="BFBFBF" w:sz="4"/>
-            </w:tcBorders>
-            <w:tcMar>
-              <w:top w:type="dxa" w:w="60"/>
-              <w:left w:type="dxa" w:w="100"/>
-              <w:bottom w:type="dxa" w:w="60"/>
-              <w:right w:type="dxa" w:w="100"/>
-            </w:tcMar>
-          </w:tcPr>
-          <w:p>
-            <w:pPr>
-              <w:jc w:val="center"/>
-            </w:pPr>
-            <w:r>
-              <w:rPr>
-                <w:b/>
-                <w:bCs/>
-              </w:rPr>
-              <w:t xml:space="preserve">АК-15</w:t>
-            </w:r>
-          </w:p>
-        </w:tc>
-        <w:tc>
-          <w:tcPr>
-            <w:tcW w:type="dxa" w:w="2700"/>
-            <w:tcBorders>
-              <w:top w:val="single" w:color="BFBFBF" w:sz="4"/>
-              <w:left w:val="single" w:color="BFBFBF" w:sz="4"/>
-              <w:bottom w:val="single" w:color="BFBFBF" w:sz="4"/>
-              <w:right w:val="single" w:color="BFBFBF" w:sz="4"/>
-            </w:tcBorders>
-            <w:tcMar>
-              <w:top w:type="dxa" w:w="60"/>
-              <w:left w:type="dxa" w:w="100"/>
-              <w:bottom w:type="dxa" w:w="60"/>
-              <w:right w:type="dxa" w:w="100"/>
-            </w:tcMar>
-          </w:tcPr>
-          <w:p>
-            <w:pPr>
-              <w:jc w:val="left"/>
-            </w:pPr>
-            <w:r>
-              <w:rPr>
-                <w:b w:val="false"/>
-                <w:bCs w:val="false"/>
-              </w:rPr>
-              <w:t xml:space="preserve">Совместимость (взаимодействие)</w:t>
-            </w:r>
-          </w:p>
-        </w:tc>
-        <w:tc>
-          <w:tcPr>
-            <w:tcW w:type="dxa" w:w="5838"/>
-            <w:tcBorders>
-              <w:top w:val="single" w:color="BFBFBF" w:sz="4"/>
-              <w:left w:val="single" w:color="BFBFBF" w:sz="4"/>
-              <w:bottom w:val="single" w:color="BFBFBF" w:sz="4"/>
-              <w:right w:val="single" w:color="BFBFBF" w:sz="4"/>
-            </w:tcBorders>
-            <w:tcMar>
-              <w:top w:type="dxa" w:w="60"/>
-              <w:left w:type="dxa" w:w="100"/>
-              <w:bottom w:type="dxa" w:w="60"/>
-              <w:right w:type="dxa" w:w="100"/>
-            </w:tcMar>
-          </w:tcPr>
-          <w:p>
-            <w:pPr>
-              <w:jc w:val="left"/>
-            </w:pPr>
-            <w:r>
-              <w:rPr>
-                <w:b w:val="false"/>
-                <w:bCs w:val="false"/>
-              </w:rPr>
-              <w:t xml:space="preserve">Регионы идентифицируются кодами ISO 3166-2:RU, координаты хранятся в системе WGS 84 — это упрощает обмен данными с другими картографическими сервисами.</w:t>
             </w:r>
           </w:p>
         </w:tc>
@@ -10170,7 +7699,7 @@
                 <w:b w:val="false"/>
                 <w:bCs w:val="false"/>
               </w:rPr>
-              <w:t xml:space="preserve">Хранилище: Docker-тома pgdata (база данных) и uploads (медиафайлы); под uploads — не менее 10 ГБ свободного места.</w:t>
+              <w:t xml:space="preserve">Клиент: современный браузер с поддержкой ES2020, Fetch API и localStorage; JavaScript должен быть включён.</w:t>
             </w:r>
           </w:p>
         </w:tc>
@@ -10233,7 +7762,7 @@
                 <w:b w:val="false"/>
                 <w:bCs w:val="false"/>
               </w:rPr>
-              <w:t xml:space="preserve">Безопасность окружения: приложение в контейнере запускается от непривилегированного пользователя, а не от root.</w:t>
+              <w:t xml:space="preserve">Клиентское устройство: экран не меньше 360×640 пикселей; интернет-соединение от 1 Мбит/с (для загрузки видео — от 5 Мбит/с).</w:t>
             </w:r>
           </w:p>
         </w:tc>
@@ -10296,322 +7825,7 @@
                 <w:b w:val="false"/>
                 <w:bCs w:val="false"/>
               </w:rPr>
-              <w:t xml:space="preserve">Часовой пояс: база данных и JDBC работают в UTC; клиент показывает дату и время в часовом поясе пользователя.</w:t>
-            </w:r>
-          </w:p>
-        </w:tc>
-      </w:tr>
-      <w:tr>
-        <w:trPr>
-          <w:cantSplit/>
-        </w:trPr>
-        <w:tc>
-          <w:tcPr>
-            <w:tcW w:type="dxa" w:w="1100"/>
-            <w:tcBorders>
-              <w:top w:val="single" w:color="BFBFBF" w:sz="4"/>
-              <w:left w:val="single" w:color="BFBFBF" w:sz="4"/>
-              <w:bottom w:val="single" w:color="BFBFBF" w:sz="4"/>
-              <w:right w:val="single" w:color="BFBFBF" w:sz="4"/>
-            </w:tcBorders>
-            <w:tcMar>
-              <w:top w:type="dxa" w:w="60"/>
-              <w:left w:type="dxa" w:w="100"/>
-              <w:bottom w:type="dxa" w:w="60"/>
-              <w:right w:type="dxa" w:w="100"/>
-            </w:tcMar>
-          </w:tcPr>
-          <w:p>
-            <w:pPr>
-              <w:jc w:val="center"/>
-            </w:pPr>
-            <w:r>
-              <w:rPr>
-                <w:b/>
-                <w:bCs/>
-              </w:rPr>
-              <w:t xml:space="preserve">СТ-11</w:t>
-            </w:r>
-          </w:p>
-        </w:tc>
-        <w:tc>
-          <w:tcPr>
-            <w:tcW w:type="dxa" w:w="8538"/>
-            <w:tcBorders>
-              <w:top w:val="single" w:color="BFBFBF" w:sz="4"/>
-              <w:left w:val="single" w:color="BFBFBF" w:sz="4"/>
-              <w:bottom w:val="single" w:color="BFBFBF" w:sz="4"/>
-              <w:right w:val="single" w:color="BFBFBF" w:sz="4"/>
-            </w:tcBorders>
-            <w:tcMar>
-              <w:top w:type="dxa" w:w="60"/>
-              <w:left w:type="dxa" w:w="100"/>
-              <w:bottom w:type="dxa" w:w="60"/>
-              <w:right w:type="dxa" w:w="100"/>
-            </w:tcMar>
-          </w:tcPr>
-          <w:p>
-            <w:pPr>
-              <w:jc w:val="left"/>
-            </w:pPr>
-            <w:r>
-              <w:rPr>
-                <w:b w:val="false"/>
-                <w:bCs w:val="false"/>
-              </w:rPr>
-              <w:t xml:space="preserve">Клиент: современный браузер с поддержкой ES2020, Fetch API и localStorage; JavaScript должен быть включён.</w:t>
-            </w:r>
-          </w:p>
-        </w:tc>
-      </w:tr>
-      <w:tr>
-        <w:trPr>
-          <w:cantSplit/>
-        </w:trPr>
-        <w:tc>
-          <w:tcPr>
-            <w:tcW w:type="dxa" w:w="1100"/>
-            <w:tcBorders>
-              <w:top w:val="single" w:color="BFBFBF" w:sz="4"/>
-              <w:left w:val="single" w:color="BFBFBF" w:sz="4"/>
-              <w:bottom w:val="single" w:color="BFBFBF" w:sz="4"/>
-              <w:right w:val="single" w:color="BFBFBF" w:sz="4"/>
-            </w:tcBorders>
-            <w:tcMar>
-              <w:top w:type="dxa" w:w="60"/>
-              <w:left w:type="dxa" w:w="100"/>
-              <w:bottom w:type="dxa" w:w="60"/>
-              <w:right w:type="dxa" w:w="100"/>
-            </w:tcMar>
-          </w:tcPr>
-          <w:p>
-            <w:pPr>
-              <w:jc w:val="center"/>
-            </w:pPr>
-            <w:r>
-              <w:rPr>
-                <w:b/>
-                <w:bCs/>
-              </w:rPr>
-              <w:t xml:space="preserve">СТ-12</w:t>
-            </w:r>
-          </w:p>
-        </w:tc>
-        <w:tc>
-          <w:tcPr>
-            <w:tcW w:type="dxa" w:w="8538"/>
-            <w:tcBorders>
-              <w:top w:val="single" w:color="BFBFBF" w:sz="4"/>
-              <w:left w:val="single" w:color="BFBFBF" w:sz="4"/>
-              <w:bottom w:val="single" w:color="BFBFBF" w:sz="4"/>
-              <w:right w:val="single" w:color="BFBFBF" w:sz="4"/>
-            </w:tcBorders>
-            <w:tcMar>
-              <w:top w:type="dxa" w:w="60"/>
-              <w:left w:type="dxa" w:w="100"/>
-              <w:bottom w:type="dxa" w:w="60"/>
-              <w:right w:type="dxa" w:w="100"/>
-            </w:tcMar>
-          </w:tcPr>
-          <w:p>
-            <w:pPr>
-              <w:jc w:val="left"/>
-            </w:pPr>
-            <w:r>
-              <w:rPr>
-                <w:b w:val="false"/>
-                <w:bCs w:val="false"/>
-              </w:rPr>
-              <w:t xml:space="preserve">Клиентское устройство: экран не меньше 360×640 пикселей; интернет-соединение от 1 Мбит/с (для загрузки видео — от 5 Мбит/с).</w:t>
-            </w:r>
-          </w:p>
-        </w:tc>
-      </w:tr>
-      <w:tr>
-        <w:trPr>
-          <w:cantSplit/>
-        </w:trPr>
-        <w:tc>
-          <w:tcPr>
-            <w:tcW w:type="dxa" w:w="1100"/>
-            <w:tcBorders>
-              <w:top w:val="single" w:color="BFBFBF" w:sz="4"/>
-              <w:left w:val="single" w:color="BFBFBF" w:sz="4"/>
-              <w:bottom w:val="single" w:color="BFBFBF" w:sz="4"/>
-              <w:right w:val="single" w:color="BFBFBF" w:sz="4"/>
-            </w:tcBorders>
-            <w:tcMar>
-              <w:top w:type="dxa" w:w="60"/>
-              <w:left w:type="dxa" w:w="100"/>
-              <w:bottom w:type="dxa" w:w="60"/>
-              <w:right w:type="dxa" w:w="100"/>
-            </w:tcMar>
-          </w:tcPr>
-          <w:p>
-            <w:pPr>
-              <w:jc w:val="center"/>
-            </w:pPr>
-            <w:r>
-              <w:rPr>
-                <w:b/>
-                <w:bCs/>
-              </w:rPr>
-              <w:t xml:space="preserve">СТ-13</w:t>
-            </w:r>
-          </w:p>
-        </w:tc>
-        <w:tc>
-          <w:tcPr>
-            <w:tcW w:type="dxa" w:w="8538"/>
-            <w:tcBorders>
-              <w:top w:val="single" w:color="BFBFBF" w:sz="4"/>
-              <w:left w:val="single" w:color="BFBFBF" w:sz="4"/>
-              <w:bottom w:val="single" w:color="BFBFBF" w:sz="4"/>
-              <w:right w:val="single" w:color="BFBFBF" w:sz="4"/>
-            </w:tcBorders>
-            <w:tcMar>
-              <w:top w:type="dxa" w:w="60"/>
-              <w:left w:type="dxa" w:w="100"/>
-              <w:bottom w:type="dxa" w:w="60"/>
-              <w:right w:type="dxa" w:w="100"/>
-            </w:tcMar>
-          </w:tcPr>
-          <w:p>
-            <w:pPr>
-              <w:jc w:val="left"/>
-            </w:pPr>
-            <w:r>
-              <w:rPr>
-                <w:b w:val="false"/>
-                <w:bCs w:val="false"/>
-              </w:rPr>
-              <w:t xml:space="preserve">Среда разработки: JDK 21, Maven 3.9 (через Maven Wrapper), Node.js 22 и npm, Docker.</w:t>
-            </w:r>
-          </w:p>
-        </w:tc>
-      </w:tr>
-      <w:tr>
-        <w:trPr>
-          <w:cantSplit/>
-        </w:trPr>
-        <w:tc>
-          <w:tcPr>
-            <w:tcW w:type="dxa" w:w="1100"/>
-            <w:tcBorders>
-              <w:top w:val="single" w:color="BFBFBF" w:sz="4"/>
-              <w:left w:val="single" w:color="BFBFBF" w:sz="4"/>
-              <w:bottom w:val="single" w:color="BFBFBF" w:sz="4"/>
-              <w:right w:val="single" w:color="BFBFBF" w:sz="4"/>
-            </w:tcBorders>
-            <w:tcMar>
-              <w:top w:type="dxa" w:w="60"/>
-              <w:left w:type="dxa" w:w="100"/>
-              <w:bottom w:type="dxa" w:w="60"/>
-              <w:right w:type="dxa" w:w="100"/>
-            </w:tcMar>
-          </w:tcPr>
-          <w:p>
-            <w:pPr>
-              <w:jc w:val="center"/>
-            </w:pPr>
-            <w:r>
-              <w:rPr>
-                <w:b/>
-                <w:bCs/>
-              </w:rPr>
-              <w:t xml:space="preserve">СТ-14</w:t>
-            </w:r>
-          </w:p>
-        </w:tc>
-        <w:tc>
-          <w:tcPr>
-            <w:tcW w:type="dxa" w:w="8538"/>
-            <w:tcBorders>
-              <w:top w:val="single" w:color="BFBFBF" w:sz="4"/>
-              <w:left w:val="single" w:color="BFBFBF" w:sz="4"/>
-              <w:bottom w:val="single" w:color="BFBFBF" w:sz="4"/>
-              <w:right w:val="single" w:color="BFBFBF" w:sz="4"/>
-            </w:tcBorders>
-            <w:tcMar>
-              <w:top w:type="dxa" w:w="60"/>
-              <w:left w:type="dxa" w:w="100"/>
-              <w:bottom w:type="dxa" w:w="60"/>
-              <w:right w:type="dxa" w:w="100"/>
-            </w:tcMar>
-          </w:tcPr>
-          <w:p>
-            <w:pPr>
-              <w:jc w:val="left"/>
-            </w:pPr>
-            <w:r>
-              <w:rPr>
-                <w:b w:val="false"/>
-                <w:bCs w:val="false"/>
-              </w:rPr>
               <w:t xml:space="preserve">Локальное окружение: docker compose запускает PostgreSQL (порт 5433) и MailHog (SMTP — порт 1025, веб-интерфейс — порт 8025); API — порт 8080, клиент — порт 5173.</w:t>
-            </w:r>
-          </w:p>
-        </w:tc>
-      </w:tr>
-      <w:tr>
-        <w:trPr>
-          <w:cantSplit/>
-        </w:trPr>
-        <w:tc>
-          <w:tcPr>
-            <w:tcW w:type="dxa" w:w="1100"/>
-            <w:tcBorders>
-              <w:top w:val="single" w:color="BFBFBF" w:sz="4"/>
-              <w:left w:val="single" w:color="BFBFBF" w:sz="4"/>
-              <w:bottom w:val="single" w:color="BFBFBF" w:sz="4"/>
-              <w:right w:val="single" w:color="BFBFBF" w:sz="4"/>
-            </w:tcBorders>
-            <w:tcMar>
-              <w:top w:type="dxa" w:w="60"/>
-              <w:left w:type="dxa" w:w="100"/>
-              <w:bottom w:type="dxa" w:w="60"/>
-              <w:right w:type="dxa" w:w="100"/>
-            </w:tcMar>
-          </w:tcPr>
-          <w:p>
-            <w:pPr>
-              <w:jc w:val="center"/>
-            </w:pPr>
-            <w:r>
-              <w:rPr>
-                <w:b/>
-                <w:bCs/>
-              </w:rPr>
-              <w:t xml:space="preserve">СТ-15</w:t>
-            </w:r>
-          </w:p>
-        </w:tc>
-        <w:tc>
-          <w:tcPr>
-            <w:tcW w:type="dxa" w:w="8538"/>
-            <w:tcBorders>
-              <w:top w:val="single" w:color="BFBFBF" w:sz="4"/>
-              <w:left w:val="single" w:color="BFBFBF" w:sz="4"/>
-              <w:bottom w:val="single" w:color="BFBFBF" w:sz="4"/>
-              <w:right w:val="single" w:color="BFBFBF" w:sz="4"/>
-            </w:tcBorders>
-            <w:tcMar>
-              <w:top w:type="dxa" w:w="60"/>
-              <w:left w:type="dxa" w:w="100"/>
-              <w:bottom w:type="dxa" w:w="60"/>
-              <w:right w:type="dxa" w:w="100"/>
-            </w:tcMar>
-          </w:tcPr>
-          <w:p>
-            <w:pPr>
-              <w:jc w:val="left"/>
-            </w:pPr>
-            <w:r>
-              <w:rPr>
-                <w:b w:val="false"/>
-                <w:bCs w:val="false"/>
-              </w:rPr>
-              <w:t xml:space="preserve">Сборка: многоэтапный Dockerfile (Node.js 22 → Maven 3.9 + JDK 21 → JRE 21 Alpine); результат — один JAR-файл, который отдаёт и API, и статику клиента.</w:t>
             </w:r>
           </w:p>
         </w:tc>
@@ -10997,7 +8211,7 @@
                 <w:b w:val="false"/>
                 <w:bCs w:val="false"/>
               </w:rPr>
-              <w:t xml:space="preserve">Как путешественник, я хочу видеть, сколько регионов из 89 я посетил, чтобы оценивать свой прогресс и ставить цели.</w:t>
+              <w:t xml:space="preserve">Как путешественник, я хочу найти город, озеро или достопримечательность по названию, чтобы быстро перейти к нему на карте.</w:t>
             </w:r>
           </w:p>
         </w:tc>
@@ -11026,7 +8240,7 @@
                 <w:b w:val="false"/>
                 <w:bCs w:val="false"/>
               </w:rPr>
-              <w:t xml:space="preserve">Средний</w:t>
+              <w:t xml:space="preserve">Высокий</w:t>
             </w:r>
           </w:p>
         </w:tc>
@@ -11089,7 +8303,7 @@
                 <w:b w:val="false"/>
                 <w:bCs w:val="false"/>
               </w:rPr>
-              <w:t xml:space="preserve">Как путешественник, я хочу выбрать свой цвет для каждого региона, чтобы, например, выделять поездки разных лет.</w:t>
+              <w:t xml:space="preserve">Как путешественник, я хочу поставить на карте точку в понравившемся месте и подписать её, чтобы не забыть, где это было.</w:t>
             </w:r>
           </w:p>
         </w:tc>
@@ -11118,7 +8332,7 @@
                 <w:b w:val="false"/>
                 <w:bCs w:val="false"/>
               </w:rPr>
-              <w:t xml:space="preserve">Низкий</w:t>
+              <w:t xml:space="preserve">Высокий</w:t>
             </w:r>
           </w:p>
         </w:tc>
@@ -11181,7 +8395,7 @@
                 <w:b w:val="false"/>
                 <w:bCs w:val="false"/>
               </w:rPr>
-              <w:t xml:space="preserve">Как путешественник, я хочу найти город, озеро или достопримечательность по названию, чтобы быстро перейти к нему на карте.</w:t>
+              <w:t xml:space="preserve">Как путешественник, я хочу прикрепить фото и видео к точке или истории, чтобы хранить воспоминания рядом с местом, где они появились.</w:t>
             </w:r>
           </w:p>
         </w:tc>
@@ -11273,7 +8487,7 @@
                 <w:b w:val="false"/>
                 <w:bCs w:val="false"/>
               </w:rPr>
-              <w:t xml:space="preserve">Как путешественник, я хочу поставить на карте точку в понравившемся месте и подписать её, чтобы не забыть, где это было.</w:t>
+              <w:t xml:space="preserve">Как путешественник, я хочу написать историю о поездке и привязать её к региону, чтобы вести дневник путешествий.</w:t>
             </w:r>
           </w:p>
         </w:tc>
@@ -11365,7 +8579,7 @@
                 <w:b w:val="false"/>
                 <w:bCs w:val="false"/>
               </w:rPr>
-              <w:t xml:space="preserve">Как путешественник, я хочу прикрепить фото и видео к точке или истории, чтобы хранить воспоминания рядом с местом, где они появились.</w:t>
+              <w:t xml:space="preserve">Как путешественник, я хочу найти друга по имени или email и добавить его, чтобы делиться друг с другом картами.</w:t>
             </w:r>
           </w:p>
         </w:tc>
@@ -11457,7 +8671,7 @@
                 <w:b w:val="false"/>
                 <w:bCs w:val="false"/>
               </w:rPr>
-              <w:t xml:space="preserve">Как путешественник, я хочу написать историю о поездке и привязать её к региону, чтобы вести дневник путешествий.</w:t>
+              <w:t xml:space="preserve">Как друг, я хочу смотреть карту, истории и фото друга, чтобы вдохновляться и планировать свои поездки.</w:t>
             </w:r>
           </w:p>
         </w:tc>
@@ -11549,7 +8763,7 @@
                 <w:b w:val="false"/>
                 <w:bCs w:val="false"/>
               </w:rPr>
-              <w:t xml:space="preserve">Как путешественник, я хочу найти свою старую историю по слову или региону, чтобы быстро вспомнить поездку.</w:t>
+              <w:t xml:space="preserve">Как путешественник, я хочу восстановить пароль по коду из письма, чтобы не потерять свою карту, если забыл пароль.</w:t>
             </w:r>
           </w:p>
         </w:tc>
@@ -11578,7 +8792,7 @@
                 <w:b w:val="false"/>
                 <w:bCs w:val="false"/>
               </w:rPr>
-              <w:t xml:space="preserve">Средний</w:t>
+              <w:t xml:space="preserve">Высокий</w:t>
             </w:r>
           </w:p>
         </w:tc>
@@ -11613,466 +8827,6 @@
                 <w:bCs/>
               </w:rPr>
               <w:t xml:space="preserve">ПТ-10</w:t>
-            </w:r>
-          </w:p>
-        </w:tc>
-        <w:tc>
-          <w:tcPr>
-            <w:tcW w:type="dxa" w:w="7138"/>
-            <w:tcBorders>
-              <w:top w:val="single" w:color="BFBFBF" w:sz="4"/>
-              <w:left w:val="single" w:color="BFBFBF" w:sz="4"/>
-              <w:bottom w:val="single" w:color="BFBFBF" w:sz="4"/>
-              <w:right w:val="single" w:color="BFBFBF" w:sz="4"/>
-            </w:tcBorders>
-            <w:tcMar>
-              <w:top w:type="dxa" w:w="60"/>
-              <w:left w:type="dxa" w:w="100"/>
-              <w:bottom w:type="dxa" w:w="60"/>
-              <w:right w:type="dxa" w:w="100"/>
-            </w:tcMar>
-          </w:tcPr>
-          <w:p>
-            <w:pPr>
-              <w:jc w:val="left"/>
-            </w:pPr>
-            <w:r>
-              <w:rPr>
-                <w:b w:val="false"/>
-                <w:bCs w:val="false"/>
-              </w:rPr>
-              <w:t xml:space="preserve">Как путешественник, я хочу найти друга по имени или email и добавить его, чтобы делиться друг с другом картами.</w:t>
-            </w:r>
-          </w:p>
-        </w:tc>
-        <w:tc>
-          <w:tcPr>
-            <w:tcW w:type="dxa" w:w="1400"/>
-            <w:tcBorders>
-              <w:top w:val="single" w:color="BFBFBF" w:sz="4"/>
-              <w:left w:val="single" w:color="BFBFBF" w:sz="4"/>
-              <w:bottom w:val="single" w:color="BFBFBF" w:sz="4"/>
-              <w:right w:val="single" w:color="BFBFBF" w:sz="4"/>
-            </w:tcBorders>
-            <w:tcMar>
-              <w:top w:type="dxa" w:w="60"/>
-              <w:left w:type="dxa" w:w="100"/>
-              <w:bottom w:type="dxa" w:w="60"/>
-              <w:right w:type="dxa" w:w="100"/>
-            </w:tcMar>
-          </w:tcPr>
-          <w:p>
-            <w:pPr>
-              <w:jc w:val="center"/>
-            </w:pPr>
-            <w:r>
-              <w:rPr>
-                <w:b w:val="false"/>
-                <w:bCs w:val="false"/>
-              </w:rPr>
-              <w:t xml:space="preserve">Высокий</w:t>
-            </w:r>
-          </w:p>
-        </w:tc>
-      </w:tr>
-      <w:tr>
-        <w:trPr>
-          <w:cantSplit/>
-        </w:trPr>
-        <w:tc>
-          <w:tcPr>
-            <w:tcW w:type="dxa" w:w="1100"/>
-            <w:tcBorders>
-              <w:top w:val="single" w:color="BFBFBF" w:sz="4"/>
-              <w:left w:val="single" w:color="BFBFBF" w:sz="4"/>
-              <w:bottom w:val="single" w:color="BFBFBF" w:sz="4"/>
-              <w:right w:val="single" w:color="BFBFBF" w:sz="4"/>
-            </w:tcBorders>
-            <w:tcMar>
-              <w:top w:type="dxa" w:w="60"/>
-              <w:left w:type="dxa" w:w="100"/>
-              <w:bottom w:type="dxa" w:w="60"/>
-              <w:right w:type="dxa" w:w="100"/>
-            </w:tcMar>
-          </w:tcPr>
-          <w:p>
-            <w:pPr>
-              <w:jc w:val="center"/>
-            </w:pPr>
-            <w:r>
-              <w:rPr>
-                <w:b/>
-                <w:bCs/>
-              </w:rPr>
-              <w:t xml:space="preserve">ПТ-11</w:t>
-            </w:r>
-          </w:p>
-        </w:tc>
-        <w:tc>
-          <w:tcPr>
-            <w:tcW w:type="dxa" w:w="7138"/>
-            <w:tcBorders>
-              <w:top w:val="single" w:color="BFBFBF" w:sz="4"/>
-              <w:left w:val="single" w:color="BFBFBF" w:sz="4"/>
-              <w:bottom w:val="single" w:color="BFBFBF" w:sz="4"/>
-              <w:right w:val="single" w:color="BFBFBF" w:sz="4"/>
-            </w:tcBorders>
-            <w:tcMar>
-              <w:top w:type="dxa" w:w="60"/>
-              <w:left w:type="dxa" w:w="100"/>
-              <w:bottom w:type="dxa" w:w="60"/>
-              <w:right w:type="dxa" w:w="100"/>
-            </w:tcMar>
-          </w:tcPr>
-          <w:p>
-            <w:pPr>
-              <w:jc w:val="left"/>
-            </w:pPr>
-            <w:r>
-              <w:rPr>
-                <w:b w:val="false"/>
-                <w:bCs w:val="false"/>
-              </w:rPr>
-              <w:t xml:space="preserve">Как друг, я хочу смотреть карту, истории и фото друга, чтобы вдохновляться и планировать свои поездки.</w:t>
-            </w:r>
-          </w:p>
-        </w:tc>
-        <w:tc>
-          <w:tcPr>
-            <w:tcW w:type="dxa" w:w="1400"/>
-            <w:tcBorders>
-              <w:top w:val="single" w:color="BFBFBF" w:sz="4"/>
-              <w:left w:val="single" w:color="BFBFBF" w:sz="4"/>
-              <w:bottom w:val="single" w:color="BFBFBF" w:sz="4"/>
-              <w:right w:val="single" w:color="BFBFBF" w:sz="4"/>
-            </w:tcBorders>
-            <w:tcMar>
-              <w:top w:type="dxa" w:w="60"/>
-              <w:left w:type="dxa" w:w="100"/>
-              <w:bottom w:type="dxa" w:w="60"/>
-              <w:right w:type="dxa" w:w="100"/>
-            </w:tcMar>
-          </w:tcPr>
-          <w:p>
-            <w:pPr>
-              <w:jc w:val="center"/>
-            </w:pPr>
-            <w:r>
-              <w:rPr>
-                <w:b w:val="false"/>
-                <w:bCs w:val="false"/>
-              </w:rPr>
-              <w:t xml:space="preserve">Высокий</w:t>
-            </w:r>
-          </w:p>
-        </w:tc>
-      </w:tr>
-      <w:tr>
-        <w:trPr>
-          <w:cantSplit/>
-        </w:trPr>
-        <w:tc>
-          <w:tcPr>
-            <w:tcW w:type="dxa" w:w="1100"/>
-            <w:tcBorders>
-              <w:top w:val="single" w:color="BFBFBF" w:sz="4"/>
-              <w:left w:val="single" w:color="BFBFBF" w:sz="4"/>
-              <w:bottom w:val="single" w:color="BFBFBF" w:sz="4"/>
-              <w:right w:val="single" w:color="BFBFBF" w:sz="4"/>
-            </w:tcBorders>
-            <w:tcMar>
-              <w:top w:type="dxa" w:w="60"/>
-              <w:left w:type="dxa" w:w="100"/>
-              <w:bottom w:type="dxa" w:w="60"/>
-              <w:right w:type="dxa" w:w="100"/>
-            </w:tcMar>
-          </w:tcPr>
-          <w:p>
-            <w:pPr>
-              <w:jc w:val="center"/>
-            </w:pPr>
-            <w:r>
-              <w:rPr>
-                <w:b/>
-                <w:bCs/>
-              </w:rPr>
-              <w:t xml:space="preserve">ПТ-12</w:t>
-            </w:r>
-          </w:p>
-        </w:tc>
-        <w:tc>
-          <w:tcPr>
-            <w:tcW w:type="dxa" w:w="7138"/>
-            <w:tcBorders>
-              <w:top w:val="single" w:color="BFBFBF" w:sz="4"/>
-              <w:left w:val="single" w:color="BFBFBF" w:sz="4"/>
-              <w:bottom w:val="single" w:color="BFBFBF" w:sz="4"/>
-              <w:right w:val="single" w:color="BFBFBF" w:sz="4"/>
-            </w:tcBorders>
-            <w:tcMar>
-              <w:top w:type="dxa" w:w="60"/>
-              <w:left w:type="dxa" w:w="100"/>
-              <w:bottom w:type="dxa" w:w="60"/>
-              <w:right w:type="dxa" w:w="100"/>
-            </w:tcMar>
-          </w:tcPr>
-          <w:p>
-            <w:pPr>
-              <w:jc w:val="left"/>
-            </w:pPr>
-            <w:r>
-              <w:rPr>
-                <w:b w:val="false"/>
-                <w:bCs w:val="false"/>
-              </w:rPr>
-              <w:t xml:space="preserve">Как путешественник, я хочу получать уведомление, когда меня хотят добавить в друзья или приняли мою заявку, чтобы вовремя ответить.</w:t>
-            </w:r>
-          </w:p>
-        </w:tc>
-        <w:tc>
-          <w:tcPr>
-            <w:tcW w:type="dxa" w:w="1400"/>
-            <w:tcBorders>
-              <w:top w:val="single" w:color="BFBFBF" w:sz="4"/>
-              <w:left w:val="single" w:color="BFBFBF" w:sz="4"/>
-              <w:bottom w:val="single" w:color="BFBFBF" w:sz="4"/>
-              <w:right w:val="single" w:color="BFBFBF" w:sz="4"/>
-            </w:tcBorders>
-            <w:tcMar>
-              <w:top w:type="dxa" w:w="60"/>
-              <w:left w:type="dxa" w:w="100"/>
-              <w:bottom w:type="dxa" w:w="60"/>
-              <w:right w:type="dxa" w:w="100"/>
-            </w:tcMar>
-          </w:tcPr>
-          <w:p>
-            <w:pPr>
-              <w:jc w:val="center"/>
-            </w:pPr>
-            <w:r>
-              <w:rPr>
-                <w:b w:val="false"/>
-                <w:bCs w:val="false"/>
-              </w:rPr>
-              <w:t xml:space="preserve">Средний</w:t>
-            </w:r>
-          </w:p>
-        </w:tc>
-      </w:tr>
-      <w:tr>
-        <w:trPr>
-          <w:cantSplit/>
-        </w:trPr>
-        <w:tc>
-          <w:tcPr>
-            <w:tcW w:type="dxa" w:w="1100"/>
-            <w:tcBorders>
-              <w:top w:val="single" w:color="BFBFBF" w:sz="4"/>
-              <w:left w:val="single" w:color="BFBFBF" w:sz="4"/>
-              <w:bottom w:val="single" w:color="BFBFBF" w:sz="4"/>
-              <w:right w:val="single" w:color="BFBFBF" w:sz="4"/>
-            </w:tcBorders>
-            <w:tcMar>
-              <w:top w:type="dxa" w:w="60"/>
-              <w:left w:type="dxa" w:w="100"/>
-              <w:bottom w:type="dxa" w:w="60"/>
-              <w:right w:type="dxa" w:w="100"/>
-            </w:tcMar>
-          </w:tcPr>
-          <w:p>
-            <w:pPr>
-              <w:jc w:val="center"/>
-            </w:pPr>
-            <w:r>
-              <w:rPr>
-                <w:b/>
-                <w:bCs/>
-              </w:rPr>
-              <w:t xml:space="preserve">ПТ-13</w:t>
-            </w:r>
-          </w:p>
-        </w:tc>
-        <w:tc>
-          <w:tcPr>
-            <w:tcW w:type="dxa" w:w="7138"/>
-            <w:tcBorders>
-              <w:top w:val="single" w:color="BFBFBF" w:sz="4"/>
-              <w:left w:val="single" w:color="BFBFBF" w:sz="4"/>
-              <w:bottom w:val="single" w:color="BFBFBF" w:sz="4"/>
-              <w:right w:val="single" w:color="BFBFBF" w:sz="4"/>
-            </w:tcBorders>
-            <w:tcMar>
-              <w:top w:type="dxa" w:w="60"/>
-              <w:left w:type="dxa" w:w="100"/>
-              <w:bottom w:type="dxa" w:w="60"/>
-              <w:right w:type="dxa" w:w="100"/>
-            </w:tcMar>
-          </w:tcPr>
-          <w:p>
-            <w:pPr>
-              <w:jc w:val="left"/>
-            </w:pPr>
-            <w:r>
-              <w:rPr>
-                <w:b w:val="false"/>
-                <w:bCs w:val="false"/>
-              </w:rPr>
-              <w:t xml:space="preserve">Как путешественник, я хочу быть уверен, что мои фото и истории не увидят посторонние, чтобы спокойно делиться личным.</w:t>
-            </w:r>
-          </w:p>
-        </w:tc>
-        <w:tc>
-          <w:tcPr>
-            <w:tcW w:type="dxa" w:w="1400"/>
-            <w:tcBorders>
-              <w:top w:val="single" w:color="BFBFBF" w:sz="4"/>
-              <w:left w:val="single" w:color="BFBFBF" w:sz="4"/>
-              <w:bottom w:val="single" w:color="BFBFBF" w:sz="4"/>
-              <w:right w:val="single" w:color="BFBFBF" w:sz="4"/>
-            </w:tcBorders>
-            <w:tcMar>
-              <w:top w:type="dxa" w:w="60"/>
-              <w:left w:type="dxa" w:w="100"/>
-              <w:bottom w:type="dxa" w:w="60"/>
-              <w:right w:type="dxa" w:w="100"/>
-            </w:tcMar>
-          </w:tcPr>
-          <w:p>
-            <w:pPr>
-              <w:jc w:val="center"/>
-            </w:pPr>
-            <w:r>
-              <w:rPr>
-                <w:b w:val="false"/>
-                <w:bCs w:val="false"/>
-              </w:rPr>
-              <w:t xml:space="preserve">Высокий</w:t>
-            </w:r>
-          </w:p>
-        </w:tc>
-      </w:tr>
-      <w:tr>
-        <w:trPr>
-          <w:cantSplit/>
-        </w:trPr>
-        <w:tc>
-          <w:tcPr>
-            <w:tcW w:type="dxa" w:w="1100"/>
-            <w:tcBorders>
-              <w:top w:val="single" w:color="BFBFBF" w:sz="4"/>
-              <w:left w:val="single" w:color="BFBFBF" w:sz="4"/>
-              <w:bottom w:val="single" w:color="BFBFBF" w:sz="4"/>
-              <w:right w:val="single" w:color="BFBFBF" w:sz="4"/>
-            </w:tcBorders>
-            <w:tcMar>
-              <w:top w:type="dxa" w:w="60"/>
-              <w:left w:type="dxa" w:w="100"/>
-              <w:bottom w:type="dxa" w:w="60"/>
-              <w:right w:type="dxa" w:w="100"/>
-            </w:tcMar>
-          </w:tcPr>
-          <w:p>
-            <w:pPr>
-              <w:jc w:val="center"/>
-            </w:pPr>
-            <w:r>
-              <w:rPr>
-                <w:b/>
-                <w:bCs/>
-              </w:rPr>
-              <w:t xml:space="preserve">ПТ-14</w:t>
-            </w:r>
-          </w:p>
-        </w:tc>
-        <w:tc>
-          <w:tcPr>
-            <w:tcW w:type="dxa" w:w="7138"/>
-            <w:tcBorders>
-              <w:top w:val="single" w:color="BFBFBF" w:sz="4"/>
-              <w:left w:val="single" w:color="BFBFBF" w:sz="4"/>
-              <w:bottom w:val="single" w:color="BFBFBF" w:sz="4"/>
-              <w:right w:val="single" w:color="BFBFBF" w:sz="4"/>
-            </w:tcBorders>
-            <w:tcMar>
-              <w:top w:type="dxa" w:w="60"/>
-              <w:left w:type="dxa" w:w="100"/>
-              <w:bottom w:type="dxa" w:w="60"/>
-              <w:right w:type="dxa" w:w="100"/>
-            </w:tcMar>
-          </w:tcPr>
-          <w:p>
-            <w:pPr>
-              <w:jc w:val="left"/>
-            </w:pPr>
-            <w:r>
-              <w:rPr>
-                <w:b w:val="false"/>
-                <w:bCs w:val="false"/>
-              </w:rPr>
-              <w:t xml:space="preserve">Как путешественник, я хочу восстановить пароль по коду из письма, чтобы не потерять свою карту, если забыл пароль.</w:t>
-            </w:r>
-          </w:p>
-        </w:tc>
-        <w:tc>
-          <w:tcPr>
-            <w:tcW w:type="dxa" w:w="1400"/>
-            <w:tcBorders>
-              <w:top w:val="single" w:color="BFBFBF" w:sz="4"/>
-              <w:left w:val="single" w:color="BFBFBF" w:sz="4"/>
-              <w:bottom w:val="single" w:color="BFBFBF" w:sz="4"/>
-              <w:right w:val="single" w:color="BFBFBF" w:sz="4"/>
-            </w:tcBorders>
-            <w:tcMar>
-              <w:top w:type="dxa" w:w="60"/>
-              <w:left w:type="dxa" w:w="100"/>
-              <w:bottom w:type="dxa" w:w="60"/>
-              <w:right w:type="dxa" w:w="100"/>
-            </w:tcMar>
-          </w:tcPr>
-          <w:p>
-            <w:pPr>
-              <w:jc w:val="center"/>
-            </w:pPr>
-            <w:r>
-              <w:rPr>
-                <w:b w:val="false"/>
-                <w:bCs w:val="false"/>
-              </w:rPr>
-              <w:t xml:space="preserve">Высокий</w:t>
-            </w:r>
-          </w:p>
-        </w:tc>
-      </w:tr>
-      <w:tr>
-        <w:trPr>
-          <w:cantSplit/>
-        </w:trPr>
-        <w:tc>
-          <w:tcPr>
-            <w:tcW w:type="dxa" w:w="1100"/>
-            <w:tcBorders>
-              <w:top w:val="single" w:color="BFBFBF" w:sz="4"/>
-              <w:left w:val="single" w:color="BFBFBF" w:sz="4"/>
-              <w:bottom w:val="single" w:color="BFBFBF" w:sz="4"/>
-              <w:right w:val="single" w:color="BFBFBF" w:sz="4"/>
-            </w:tcBorders>
-            <w:tcMar>
-              <w:top w:type="dxa" w:w="60"/>
-              <w:left w:type="dxa" w:w="100"/>
-              <w:bottom w:type="dxa" w:w="60"/>
-              <w:right w:type="dxa" w:w="100"/>
-            </w:tcMar>
-          </w:tcPr>
-          <w:p>
-            <w:pPr>
-              <w:jc w:val="center"/>
-            </w:pPr>
-            <w:r>
-              <w:rPr>
-                <w:b/>
-                <w:bCs/>
-              </w:rPr>
-              <w:t xml:space="preserve">ПТ-15</w:t>
             </w:r>
           </w:p>
         </w:tc>

</xml_diff>